<commit_message>
UI changes on the admin edit form
</commit_message>
<xml_diff>
--- a/public/doc-templates/KP/penilaian-kp.docx
+++ b/public/doc-templates/KP/penilaian-kp.docx
@@ -88,25 +88,7 @@
           <w:sz w:val="24"/>
           <w:szCs w:val="24"/>
         </w:rPr>
-        <w:t>No:  {</w:t>
-      </w:r>
-      <w:proofErr w:type="spellStart"/>
-      <w:r>
-        <w:rPr>
-          <w:rFonts w:ascii="Times New Roman" w:eastAsia="Calibri" w:hAnsi="Times New Roman" w:cs="Times New Roman"/>
-          <w:sz w:val="24"/>
-          <w:szCs w:val="24"/>
-        </w:rPr>
-        <w:t>no_surat</w:t>
-      </w:r>
-      <w:proofErr w:type="spellEnd"/>
-      <w:r>
-        <w:rPr>
-          <w:rFonts w:ascii="Times New Roman" w:eastAsia="Calibri" w:hAnsi="Times New Roman" w:cs="Times New Roman"/>
-          <w:sz w:val="24"/>
-          <w:szCs w:val="24"/>
-        </w:rPr>
-        <w:t>}</w:t>
+        <w:t>No:  {no_surat}</w:t>
       </w:r>
     </w:p>
     <w:tbl>
@@ -148,18 +130,8 @@
                 <w:sz w:val="24"/>
                 <w:szCs w:val="24"/>
               </w:rPr>
-              <w:t xml:space="preserve">Hari, </w:t>
-            </w:r>
-            <w:proofErr w:type="spellStart"/>
-            <w:r>
-              <w:rPr>
-                <w:rFonts w:ascii="Times New Roman" w:eastAsia="Calibri" w:hAnsi="Times New Roman" w:cs="Times New Roman"/>
-                <w:sz w:val="24"/>
-                <w:szCs w:val="24"/>
-              </w:rPr>
-              <w:t>Tanggal</w:t>
-            </w:r>
-            <w:proofErr w:type="spellEnd"/>
+              <w:t>Hari, Tanggal</w:t>
+            </w:r>
           </w:p>
         </w:tc>
         <w:tc>
@@ -182,113 +154,7 @@
                 <w:sz w:val="24"/>
                 <w:szCs w:val="24"/>
               </w:rPr>
-              <w:t xml:space="preserve">: {hari_cetak}</w:t>
-            </w:r>
-            <w:proofErr w:type="spellStart"/>
-            <w:r>
-              <w:rPr>
-                <w:rFonts w:ascii="Times New Roman" w:eastAsia="Calibri" w:hAnsi="Times New Roman" w:cs="Times New Roman"/>
-                <w:sz w:val="24"/>
-                <w:szCs w:val="24"/>
-              </w:rPr>
-              <w:t xml:space="preserve"/>
-            </w:r>
-            <w:proofErr w:type="spellEnd"/>
-            <w:r>
-              <w:rPr>
-                <w:rFonts w:ascii="Times New Roman" w:eastAsia="Calibri" w:hAnsi="Times New Roman" w:cs="Times New Roman"/>
-                <w:sz w:val="24"/>
-                <w:szCs w:val="24"/>
-              </w:rPr>
-              <w:t xml:space="preserve">, {tgl_cetak}</w:t>
-            </w:r>
-            <w:proofErr w:type="spellStart"/>
-            <w:r>
-              <w:rPr>
-                <w:rFonts w:ascii="Times New Roman" w:eastAsia="Calibri" w:hAnsi="Times New Roman" w:cs="Times New Roman"/>
-                <w:sz w:val="24"/>
-                <w:szCs w:val="24"/>
-              </w:rPr>
-              <w:t xml:space="preserve"/>
-            </w:r>
-            <w:proofErr w:type="spellEnd"/>
-            <w:r>
-              <w:rPr>
-                <w:rFonts w:ascii="Times New Roman" w:eastAsia="Calibri" w:hAnsi="Times New Roman" w:cs="Times New Roman"/>
-                <w:sz w:val="24"/>
-                <w:szCs w:val="24"/>
-              </w:rPr>
-              <w:t xml:space="preserve"> </w:t>
-            </w:r>
-          </w:p>
-        </w:tc>
-      </w:tr>
-      <w:tr>
-        <w:tc>
-          <w:tcPr>
-            <w:tcW w:w="1696" w:type="dxa"/>
-          </w:tcPr>
-          <w:p>
-            <w:pPr>
-              <w:spacing w:line="276" w:lineRule="auto"/>
-              <w:jc w:val="both"/>
-              <w:rPr>
-                <w:rFonts w:ascii="Times New Roman" w:eastAsia="Calibri" w:hAnsi="Times New Roman" w:cs="Times New Roman"/>
-                <w:sz w:val="24"/>
-                <w:szCs w:val="24"/>
-              </w:rPr>
-            </w:pPr>
-            <w:proofErr w:type="spellStart"/>
-            <w:r>
-              <w:rPr>
-                <w:rFonts w:ascii="Times New Roman" w:eastAsia="Calibri" w:hAnsi="Times New Roman" w:cs="Times New Roman"/>
-                <w:sz w:val="24"/>
-                <w:szCs w:val="24"/>
-              </w:rPr>
-              <w:t>Tempat</w:t>
-            </w:r>
-            <w:proofErr w:type="spellEnd"/>
-          </w:p>
-        </w:tc>
-        <w:tc>
-          <w:tcPr>
-            <w:tcW w:w="8369" w:type="dxa"/>
-          </w:tcPr>
-          <w:p>
-            <w:pPr>
-              <w:spacing w:line="276" w:lineRule="auto"/>
-              <w:jc w:val="both"/>
-              <w:rPr>
-                <w:rFonts w:ascii="Times New Roman" w:eastAsia="Calibri" w:hAnsi="Times New Roman" w:cs="Times New Roman"/>
-                <w:sz w:val="24"/>
-                <w:szCs w:val="24"/>
-              </w:rPr>
-            </w:pPr>
-            <w:r>
-              <w:rPr>
-                <w:rFonts w:ascii="Times New Roman" w:eastAsia="Calibri" w:hAnsi="Times New Roman" w:cs="Times New Roman"/>
-                <w:sz w:val="24"/>
-                <w:szCs w:val="24"/>
-              </w:rPr>
-              <w:t xml:space="preserve">: </w:t>
-            </w:r>
-            <w:proofErr w:type="spellStart"/>
-            <w:r>
-              <w:rPr>
-                <w:rFonts w:ascii="Times New Roman" w:eastAsia="Calibri" w:hAnsi="Times New Roman" w:cs="Times New Roman"/>
-                <w:sz w:val="24"/>
-                <w:szCs w:val="24"/>
-              </w:rPr>
-              <w:t xml:space="preserve"/>
-            </w:r>
-            <w:proofErr w:type="spellEnd"/>
-            <w:r>
-              <w:rPr>
-                <w:rFonts w:ascii="Times New Roman" w:eastAsia="Calibri" w:hAnsi="Times New Roman" w:cs="Times New Roman"/>
-                <w:sz w:val="24"/>
-                <w:szCs w:val="24"/>
-              </w:rPr>
-              <w:t xml:space="preserve"/>
+              <w:t xml:space="preserve">: {hari_cetak}, {tgl_cetak} </w:t>
             </w:r>
           </w:p>
         </w:tc>
@@ -321,97 +187,7 @@
           <w:sz w:val="24"/>
           <w:szCs w:val="24"/>
         </w:rPr>
-        <w:t xml:space="preserve">Telah </w:t>
-      </w:r>
-      <w:proofErr w:type="spellStart"/>
-      <w:r>
-        <w:rPr>
-          <w:rFonts w:ascii="Times New Roman" w:eastAsia="Calibri" w:hAnsi="Times New Roman" w:cs="Times New Roman"/>
-          <w:sz w:val="24"/>
-          <w:szCs w:val="24"/>
-        </w:rPr>
-        <w:t>dilaksanakan</w:t>
-      </w:r>
-      <w:proofErr w:type="spellEnd"/>
-      <w:r>
-        <w:rPr>
-          <w:rFonts w:ascii="Times New Roman" w:eastAsia="Calibri" w:hAnsi="Times New Roman" w:cs="Times New Roman"/>
-          <w:sz w:val="24"/>
-          <w:szCs w:val="24"/>
-        </w:rPr>
-        <w:t xml:space="preserve"> </w:t>
-      </w:r>
-      <w:proofErr w:type="spellStart"/>
-      <w:r>
-        <w:rPr>
-          <w:rFonts w:ascii="Times New Roman" w:eastAsia="Calibri" w:hAnsi="Times New Roman" w:cs="Times New Roman"/>
-          <w:sz w:val="24"/>
-          <w:szCs w:val="24"/>
-        </w:rPr>
-        <w:t>Kerja</w:t>
-      </w:r>
-      <w:proofErr w:type="spellEnd"/>
-      <w:r>
-        <w:rPr>
-          <w:rFonts w:ascii="Times New Roman" w:eastAsia="Calibri" w:hAnsi="Times New Roman" w:cs="Times New Roman"/>
-          <w:sz w:val="24"/>
-          <w:szCs w:val="24"/>
-        </w:rPr>
-        <w:t xml:space="preserve"> </w:t>
-      </w:r>
-      <w:proofErr w:type="spellStart"/>
-      <w:r>
-        <w:rPr>
-          <w:rFonts w:ascii="Times New Roman" w:eastAsia="Calibri" w:hAnsi="Times New Roman" w:cs="Times New Roman"/>
-          <w:sz w:val="24"/>
-          <w:szCs w:val="24"/>
-        </w:rPr>
-        <w:t>Praktik</w:t>
-      </w:r>
-      <w:proofErr w:type="spellEnd"/>
-      <w:r>
-        <w:rPr>
-          <w:rFonts w:ascii="Times New Roman" w:eastAsia="Calibri" w:hAnsi="Times New Roman" w:cs="Times New Roman"/>
-          <w:sz w:val="24"/>
-          <w:szCs w:val="24"/>
-        </w:rPr>
-        <w:t xml:space="preserve"> </w:t>
-      </w:r>
-      <w:proofErr w:type="spellStart"/>
-      <w:r>
-        <w:rPr>
-          <w:rFonts w:ascii="Times New Roman" w:eastAsia="Calibri" w:hAnsi="Times New Roman" w:cs="Times New Roman"/>
-          <w:sz w:val="24"/>
-          <w:szCs w:val="24"/>
-        </w:rPr>
-        <w:t>mahasiswa</w:t>
-      </w:r>
-      <w:proofErr w:type="spellEnd"/>
-      <w:r>
-        <w:rPr>
-          <w:rFonts w:ascii="Times New Roman" w:eastAsia="Calibri" w:hAnsi="Times New Roman" w:cs="Times New Roman"/>
-          <w:sz w:val="24"/>
-          <w:szCs w:val="24"/>
-        </w:rPr>
-        <w:t xml:space="preserve"> </w:t>
-      </w:r>
-      <w:proofErr w:type="spellStart"/>
-      <w:r>
-        <w:rPr>
-          <w:rFonts w:ascii="Times New Roman" w:eastAsia="Calibri" w:hAnsi="Times New Roman" w:cs="Times New Roman"/>
-          <w:sz w:val="24"/>
-          <w:szCs w:val="24"/>
-        </w:rPr>
-        <w:t>berikut</w:t>
-      </w:r>
-      <w:proofErr w:type="spellEnd"/>
-      <w:r>
-        <w:rPr>
-          <w:rFonts w:ascii="Times New Roman" w:eastAsia="Calibri" w:hAnsi="Times New Roman" w:cs="Times New Roman"/>
-          <w:sz w:val="24"/>
-          <w:szCs w:val="24"/>
-        </w:rPr>
-        <w:t xml:space="preserve"> :</w:t>
+        <w:t>Telah dilaksanakan Kerja Praktik mahasiswa berikut :</w:t>
       </w:r>
     </w:p>
     <w:tbl>
@@ -500,25 +276,7 @@
                 <w:sz w:val="24"/>
                 <w:szCs w:val="24"/>
               </w:rPr>
-              <w:t>{</w:t>
-            </w:r>
-            <w:proofErr w:type="spellStart"/>
-            <w:r>
-              <w:rPr>
-                <w:rFonts w:ascii="Times New Roman" w:eastAsia="Calibri" w:hAnsi="Times New Roman" w:cs="Times New Roman"/>
-                <w:sz w:val="24"/>
-                <w:szCs w:val="24"/>
-              </w:rPr>
-              <w:t>nama_mhs</w:t>
-            </w:r>
-            <w:proofErr w:type="spellEnd"/>
-            <w:r>
-              <w:rPr>
-                <w:rFonts w:ascii="Times New Roman" w:eastAsia="Calibri" w:hAnsi="Times New Roman" w:cs="Times New Roman"/>
-                <w:sz w:val="24"/>
-                <w:szCs w:val="24"/>
-              </w:rPr>
-              <w:t>}</w:t>
+              <w:t>{nama_mhs}</w:t>
             </w:r>
           </w:p>
         </w:tc>
@@ -618,23 +376,13 @@
                 <w:szCs w:val="24"/>
               </w:rPr>
             </w:pPr>
-            <w:proofErr w:type="spellStart"/>
-            <w:r>
-              <w:rPr>
-                <w:rFonts w:ascii="Times New Roman" w:eastAsia="Calibri" w:hAnsi="Times New Roman" w:cs="Times New Roman"/>
-                <w:sz w:val="24"/>
-                <w:szCs w:val="24"/>
-              </w:rPr>
-              <w:t>Judul</w:t>
-            </w:r>
-            <w:proofErr w:type="spellEnd"/>
-            <w:r>
-              <w:rPr>
-                <w:rFonts w:ascii="Times New Roman" w:eastAsia="Calibri" w:hAnsi="Times New Roman" w:cs="Times New Roman"/>
-                <w:sz w:val="24"/>
-                <w:szCs w:val="24"/>
-              </w:rPr>
-              <w:t xml:space="preserve"> KP</w:t>
+            <w:r>
+              <w:rPr>
+                <w:rFonts w:ascii="Times New Roman" w:eastAsia="Calibri" w:hAnsi="Times New Roman" w:cs="Times New Roman"/>
+                <w:sz w:val="24"/>
+                <w:szCs w:val="24"/>
+              </w:rPr>
+              <w:t>Judul KP</w:t>
             </w:r>
           </w:p>
         </w:tc>
@@ -680,25 +428,7 @@
                 <w:sz w:val="24"/>
                 <w:szCs w:val="24"/>
               </w:rPr>
-              <w:t>{</w:t>
-            </w:r>
-            <w:proofErr w:type="spellStart"/>
-            <w:r>
-              <w:rPr>
-                <w:rFonts w:ascii="Times New Roman" w:eastAsia="Calibri" w:hAnsi="Times New Roman" w:cs="Times New Roman"/>
-                <w:sz w:val="24"/>
-                <w:szCs w:val="24"/>
-              </w:rPr>
-              <w:t>judul_kp</w:t>
-            </w:r>
-            <w:proofErr w:type="spellEnd"/>
-            <w:r>
-              <w:rPr>
-                <w:rFonts w:ascii="Times New Roman" w:eastAsia="Calibri" w:hAnsi="Times New Roman" w:cs="Times New Roman"/>
-                <w:sz w:val="24"/>
-                <w:szCs w:val="24"/>
-              </w:rPr>
-              <w:t>}</w:t>
+              <w:t>{judul_kp}</w:t>
             </w:r>
           </w:p>
         </w:tc>
@@ -718,7 +448,6 @@
                 <w:szCs w:val="24"/>
               </w:rPr>
             </w:pPr>
-            <w:proofErr w:type="spellStart"/>
             <w:r>
               <w:rPr>
                 <w:rFonts w:ascii="Times New Roman" w:eastAsia="Calibri" w:hAnsi="Times New Roman" w:cs="Times New Roman"/>
@@ -727,7 +456,6 @@
               </w:rPr>
               <w:t>Pembimbing</w:t>
             </w:r>
-            <w:proofErr w:type="spellEnd"/>
           </w:p>
         </w:tc>
         <w:tc>
@@ -815,88 +543,14 @@
           <w:szCs w:val="24"/>
         </w:rPr>
       </w:pPr>
-      <w:proofErr w:type="spellStart"/>
       <w:r>
         <w:rPr>
           <w:rFonts w:ascii="Times New Roman" w:eastAsia="Calibri" w:hAnsi="Times New Roman" w:cs="Times New Roman"/>
           <w:sz w:val="24"/>
           <w:szCs w:val="24"/>
         </w:rPr>
-        <w:t>Berdasarkan</w:t>
+        <w:t>Berdasarkan hasil penilaian Kerja Prakt</w:t>
       </w:r>
-      <w:proofErr w:type="spellEnd"/>
-      <w:r>
-        <w:rPr>
-          <w:rFonts w:ascii="Times New Roman" w:eastAsia="Calibri" w:hAnsi="Times New Roman" w:cs="Times New Roman"/>
-          <w:sz w:val="24"/>
-          <w:szCs w:val="24"/>
-        </w:rPr>
-        <w:t xml:space="preserve"> </w:t>
-      </w:r>
-      <w:proofErr w:type="spellStart"/>
-      <w:r>
-        <w:rPr>
-          <w:rFonts w:ascii="Times New Roman" w:eastAsia="Calibri" w:hAnsi="Times New Roman" w:cs="Times New Roman"/>
-          <w:sz w:val="24"/>
-          <w:szCs w:val="24"/>
-        </w:rPr>
-        <w:t>hasil</w:t>
-      </w:r>
-      <w:proofErr w:type="spellEnd"/>
-      <w:r>
-        <w:rPr>
-          <w:rFonts w:ascii="Times New Roman" w:eastAsia="Calibri" w:hAnsi="Times New Roman" w:cs="Times New Roman"/>
-          <w:sz w:val="24"/>
-          <w:szCs w:val="24"/>
-        </w:rPr>
-        <w:t xml:space="preserve"> </w:t>
-      </w:r>
-      <w:proofErr w:type="spellStart"/>
-      <w:r>
-        <w:rPr>
-          <w:rFonts w:ascii="Times New Roman" w:eastAsia="Calibri" w:hAnsi="Times New Roman" w:cs="Times New Roman"/>
-          <w:sz w:val="24"/>
-          <w:szCs w:val="24"/>
-        </w:rPr>
-        <w:t>penilaian</w:t>
-      </w:r>
-      <w:proofErr w:type="spellEnd"/>
-      <w:r>
-        <w:rPr>
-          <w:rFonts w:ascii="Times New Roman" w:eastAsia="Calibri" w:hAnsi="Times New Roman" w:cs="Times New Roman"/>
-          <w:sz w:val="24"/>
-          <w:szCs w:val="24"/>
-        </w:rPr>
-        <w:t xml:space="preserve"> </w:t>
-      </w:r>
-      <w:proofErr w:type="spellStart"/>
-      <w:r>
-        <w:rPr>
-          <w:rFonts w:ascii="Times New Roman" w:eastAsia="Calibri" w:hAnsi="Times New Roman" w:cs="Times New Roman"/>
-          <w:sz w:val="24"/>
-          <w:szCs w:val="24"/>
-        </w:rPr>
-        <w:t>Kerja</w:t>
-      </w:r>
-      <w:proofErr w:type="spellEnd"/>
-      <w:r>
-        <w:rPr>
-          <w:rFonts w:ascii="Times New Roman" w:eastAsia="Calibri" w:hAnsi="Times New Roman" w:cs="Times New Roman"/>
-          <w:sz w:val="24"/>
-          <w:szCs w:val="24"/>
-        </w:rPr>
-        <w:t xml:space="preserve"> </w:t>
-      </w:r>
-      <w:proofErr w:type="spellStart"/>
-      <w:r>
-        <w:rPr>
-          <w:rFonts w:ascii="Times New Roman" w:eastAsia="Calibri" w:hAnsi="Times New Roman" w:cs="Times New Roman"/>
-          <w:sz w:val="24"/>
-          <w:szCs w:val="24"/>
-        </w:rPr>
-        <w:t>Prakt</w:t>
-      </w:r>
-      <w:proofErr w:type="spellEnd"/>
       <w:r>
         <w:rPr>
           <w:rFonts w:ascii="Times New Roman" w:eastAsia="Calibri" w:hAnsi="Times New Roman" w:cs="Times New Roman"/>
@@ -912,43 +566,7 @@
           <w:sz w:val="24"/>
           <w:szCs w:val="24"/>
         </w:rPr>
-        <w:t xml:space="preserve">k, </w:t>
-      </w:r>
-      <w:proofErr w:type="spellStart"/>
-      <w:r>
-        <w:rPr>
-          <w:rFonts w:ascii="Times New Roman" w:eastAsia="Calibri" w:hAnsi="Times New Roman" w:cs="Times New Roman"/>
-          <w:sz w:val="24"/>
-          <w:szCs w:val="24"/>
-        </w:rPr>
-        <w:t>mahasiswa</w:t>
-      </w:r>
-      <w:proofErr w:type="spellEnd"/>
-      <w:r>
-        <w:rPr>
-          <w:rFonts w:ascii="Times New Roman" w:eastAsia="Calibri" w:hAnsi="Times New Roman" w:cs="Times New Roman"/>
-          <w:sz w:val="24"/>
-          <w:szCs w:val="24"/>
-        </w:rPr>
-        <w:t xml:space="preserve"> </w:t>
-      </w:r>
-      <w:proofErr w:type="spellStart"/>
-      <w:r>
-        <w:rPr>
-          <w:rFonts w:ascii="Times New Roman" w:eastAsia="Calibri" w:hAnsi="Times New Roman" w:cs="Times New Roman"/>
-          <w:sz w:val="24"/>
-          <w:szCs w:val="24"/>
-        </w:rPr>
-        <w:t>tersebut</w:t>
-      </w:r>
-      <w:proofErr w:type="spellEnd"/>
-      <w:r>
-        <w:rPr>
-          <w:rFonts w:ascii="Times New Roman" w:eastAsia="Calibri" w:hAnsi="Times New Roman" w:cs="Times New Roman"/>
-          <w:sz w:val="24"/>
-          <w:szCs w:val="24"/>
-        </w:rPr>
-        <w:t>:</w:t>
+        <w:t>k, mahasiswa tersebut:</w:t>
       </w:r>
     </w:p>
     <w:p>
@@ -961,7 +579,6 @@
           <w:szCs w:val="24"/>
         </w:rPr>
       </w:pPr>
-      <w:proofErr w:type="spellStart"/>
       <w:r>
         <w:rPr>
           <w:rFonts w:ascii="Times New Roman" w:eastAsia="Calibri" w:hAnsi="Times New Roman" w:cs="Times New Roman"/>
@@ -970,7 +587,6 @@
         </w:rPr>
         <w:t>Dinyatakan</w:t>
       </w:r>
-      <w:proofErr w:type="spellEnd"/>
       <w:r>
         <w:rPr>
           <w:rFonts w:ascii="Times New Roman" w:eastAsia="Calibri" w:hAnsi="Times New Roman" w:cs="Times New Roman"/>
@@ -997,18 +613,8 @@
           <w:sz w:val="24"/>
           <w:szCs w:val="24"/>
         </w:rPr>
-        <w:t xml:space="preserve">Dengan </w:t>
+        <w:t>Dengan nilai</w:t>
       </w:r>
-      <w:proofErr w:type="spellStart"/>
-      <w:r>
-        <w:rPr>
-          <w:rFonts w:ascii="Times New Roman" w:eastAsia="Calibri" w:hAnsi="Times New Roman" w:cs="Times New Roman"/>
-          <w:sz w:val="24"/>
-          <w:szCs w:val="24"/>
-        </w:rPr>
-        <w:t>nilai</w:t>
-      </w:r>
-      <w:proofErr w:type="spellEnd"/>
       <w:r>
         <w:rPr>
           <w:rFonts w:ascii="Times New Roman" w:eastAsia="Calibri" w:hAnsi="Times New Roman" w:cs="Times New Roman"/>
@@ -1035,43 +641,7 @@
           <w:sz w:val="24"/>
           <w:szCs w:val="24"/>
         </w:rPr>
-        <w:t xml:space="preserve">Jika lulus </w:t>
-      </w:r>
-      <w:proofErr w:type="spellStart"/>
-      <w:r>
-        <w:rPr>
-          <w:rFonts w:ascii="Times New Roman" w:eastAsia="Calibri" w:hAnsi="Times New Roman" w:cs="Times New Roman"/>
-          <w:sz w:val="24"/>
-          <w:szCs w:val="24"/>
-        </w:rPr>
-        <w:t>dengan</w:t>
-      </w:r>
-      <w:proofErr w:type="spellEnd"/>
-      <w:r>
-        <w:rPr>
-          <w:rFonts w:ascii="Times New Roman" w:eastAsia="Calibri" w:hAnsi="Times New Roman" w:cs="Times New Roman"/>
-          <w:sz w:val="24"/>
-          <w:szCs w:val="24"/>
-        </w:rPr>
-        <w:t xml:space="preserve"> </w:t>
-      </w:r>
-      <w:proofErr w:type="spellStart"/>
-      <w:r>
-        <w:rPr>
-          <w:rFonts w:ascii="Times New Roman" w:eastAsia="Calibri" w:hAnsi="Times New Roman" w:cs="Times New Roman"/>
-          <w:sz w:val="24"/>
-          <w:szCs w:val="24"/>
-        </w:rPr>
-        <w:t>perbaikan</w:t>
-      </w:r>
-      <w:proofErr w:type="spellEnd"/>
-      <w:r>
-        <w:rPr>
-          <w:rFonts w:ascii="Times New Roman" w:eastAsia="Calibri" w:hAnsi="Times New Roman" w:cs="Times New Roman"/>
-          <w:sz w:val="24"/>
-          <w:szCs w:val="24"/>
-        </w:rPr>
-        <w:t xml:space="preserve">: </w:t>
+        <w:t xml:space="preserve">Jika lulus dengan perbaikan: </w:t>
       </w:r>
     </w:p>
     <w:p>
@@ -1090,97 +660,7 @@
           <w:sz w:val="24"/>
           <w:szCs w:val="24"/>
         </w:rPr>
-        <w:t xml:space="preserve">Masa </w:t>
-      </w:r>
-      <w:proofErr w:type="spellStart"/>
-      <w:r>
-        <w:rPr>
-          <w:rFonts w:ascii="Times New Roman" w:eastAsia="Calibri" w:hAnsi="Times New Roman" w:cs="Times New Roman"/>
-          <w:sz w:val="24"/>
-          <w:szCs w:val="24"/>
-        </w:rPr>
-        <w:t>perbaikan</w:t>
-      </w:r>
-      <w:proofErr w:type="spellEnd"/>
-      <w:r>
-        <w:rPr>
-          <w:rFonts w:ascii="Times New Roman" w:eastAsia="Calibri" w:hAnsi="Times New Roman" w:cs="Times New Roman"/>
-          <w:sz w:val="24"/>
-          <w:szCs w:val="24"/>
-        </w:rPr>
-        <w:t xml:space="preserve"> </w:t>
-      </w:r>
-      <w:proofErr w:type="spellStart"/>
-      <w:r>
-        <w:rPr>
-          <w:rFonts w:ascii="Times New Roman" w:eastAsia="Calibri" w:hAnsi="Times New Roman" w:cs="Times New Roman"/>
-          <w:sz w:val="24"/>
-          <w:szCs w:val="24"/>
-        </w:rPr>
-        <w:t>dari</w:t>
-      </w:r>
-      <w:proofErr w:type="spellEnd"/>
-      <w:r>
-        <w:rPr>
-          <w:rFonts w:ascii="Times New Roman" w:eastAsia="Calibri" w:hAnsi="Times New Roman" w:cs="Times New Roman"/>
-          <w:sz w:val="24"/>
-          <w:szCs w:val="24"/>
-        </w:rPr>
-        <w:t xml:space="preserve"> </w:t>
-      </w:r>
-      <w:proofErr w:type="spellStart"/>
-      <w:r>
-        <w:rPr>
-          <w:rFonts w:ascii="Times New Roman" w:eastAsia="Calibri" w:hAnsi="Times New Roman" w:cs="Times New Roman"/>
-          <w:sz w:val="24"/>
-          <w:szCs w:val="24"/>
-        </w:rPr>
-        <w:t>tanggal</w:t>
-      </w:r>
-      <w:proofErr w:type="spellEnd"/>
-      <w:r>
-        <w:rPr>
-          <w:rFonts w:ascii="Times New Roman" w:eastAsia="Calibri" w:hAnsi="Times New Roman" w:cs="Times New Roman"/>
-          <w:sz w:val="24"/>
-          <w:szCs w:val="24"/>
-        </w:rPr>
-        <w:t xml:space="preserve"> ________________ </w:t>
-      </w:r>
-      <w:proofErr w:type="spellStart"/>
-      <w:r>
-        <w:rPr>
-          <w:rFonts w:ascii="Times New Roman" w:eastAsia="Calibri" w:hAnsi="Times New Roman" w:cs="Times New Roman"/>
-          <w:sz w:val="24"/>
-          <w:szCs w:val="24"/>
-        </w:rPr>
-        <w:t>s.d.</w:t>
-      </w:r>
-      <w:proofErr w:type="spellEnd"/>
-      <w:r>
-        <w:rPr>
-          <w:rFonts w:ascii="Times New Roman" w:eastAsia="Calibri" w:hAnsi="Times New Roman" w:cs="Times New Roman"/>
-          <w:sz w:val="24"/>
-          <w:szCs w:val="24"/>
-        </w:rPr>
-        <w:t xml:space="preserve"> </w:t>
-      </w:r>
-      <w:proofErr w:type="spellStart"/>
-      <w:r>
-        <w:rPr>
-          <w:rFonts w:ascii="Times New Roman" w:eastAsia="Calibri" w:hAnsi="Times New Roman" w:cs="Times New Roman"/>
-          <w:sz w:val="24"/>
-          <w:szCs w:val="24"/>
-        </w:rPr>
-        <w:t>tanggal</w:t>
-      </w:r>
-      <w:proofErr w:type="spellEnd"/>
-      <w:r>
-        <w:rPr>
-          <w:rFonts w:ascii="Times New Roman" w:eastAsia="Calibri" w:hAnsi="Times New Roman" w:cs="Times New Roman"/>
-          <w:sz w:val="24"/>
-          <w:szCs w:val="24"/>
-        </w:rPr>
-        <w:t xml:space="preserve"> ___________________</w:t>
+        <w:t>Masa perbaikan dari tanggal ________________ s.d. tanggal ___________________</w:t>
       </w:r>
     </w:p>
     <w:p>
@@ -1193,7 +673,6 @@
           <w:szCs w:val="24"/>
         </w:rPr>
       </w:pPr>
-      <w:proofErr w:type="spellStart"/>
       <w:r>
         <w:rPr>
           <w:rFonts w:ascii="Times New Roman" w:eastAsia="Calibri" w:hAnsi="Times New Roman" w:cs="Times New Roman"/>
@@ -1210,7 +689,6 @@
         </w:rPr>
         <w:t>n</w:t>
       </w:r>
-      <w:proofErr w:type="spellEnd"/>
       <w:r>
         <w:rPr>
           <w:rFonts w:ascii="Times New Roman" w:eastAsia="Calibri" w:hAnsi="Times New Roman" w:cs="Times New Roman"/>
@@ -1283,25 +761,7 @@
           <w:sz w:val="24"/>
           <w:szCs w:val="24"/>
         </w:rPr>
-        <w:t xml:space="preserve">Semarang, {tgl_cetak}</w:t>
-      </w:r>
-      <w:proofErr w:type="spellStart"/>
-      <w:r>
-        <w:rPr>
-          <w:rFonts w:ascii="Times New Roman" w:eastAsia="Calibri" w:hAnsi="Times New Roman" w:cs="Times New Roman"/>
-          <w:sz w:val="24"/>
-          <w:szCs w:val="24"/>
-        </w:rPr>
-        <w:t xml:space="preserve"/>
-      </w:r>
-      <w:proofErr w:type="spellEnd"/>
-      <w:r>
-        <w:rPr>
-          <w:rFonts w:ascii="Times New Roman" w:eastAsia="Calibri" w:hAnsi="Times New Roman" w:cs="Times New Roman"/>
-          <w:sz w:val="24"/>
-          <w:szCs w:val="24"/>
-        </w:rPr>
-        <w:t xml:space="preserve"/>
+        <w:t>Semarang, {tgl_cetak}</w:t>
       </w:r>
     </w:p>
     <w:p>
@@ -1320,18 +780,8 @@
           <w:sz w:val="24"/>
           <w:szCs w:val="24"/>
         </w:rPr>
-        <w:t xml:space="preserve">Dosen </w:t>
+        <w:t>Dosen Pembimbing</w:t>
       </w:r>
-      <w:proofErr w:type="spellStart"/>
-      <w:r>
-        <w:rPr>
-          <w:rFonts w:ascii="Times New Roman" w:eastAsia="Calibri" w:hAnsi="Times New Roman" w:cs="Times New Roman"/>
-          <w:sz w:val="24"/>
-          <w:szCs w:val="24"/>
-        </w:rPr>
-        <w:t>Pembimbing</w:t>
-      </w:r>
-      <w:proofErr w:type="spellEnd"/>
     </w:p>
     <w:p>
       <w:pPr>
@@ -1422,90 +872,8 @@
           <w:sz w:val="18"/>
           <w:szCs w:val="18"/>
         </w:rPr>
-        <w:t xml:space="preserve">Ket : </w:t>
+        <w:t>Ket : Setelah form di nilai kembalikan ke admin lagi</w:t>
       </w:r>
-      <w:proofErr w:type="spellStart"/>
-      <w:r>
-        <w:rPr>
-          <w:rFonts w:ascii="Times New Roman" w:eastAsia="Calibri" w:hAnsi="Times New Roman" w:cs="Times New Roman"/>
-          <w:sz w:val="18"/>
-          <w:szCs w:val="18"/>
-        </w:rPr>
-        <w:t>Setelah</w:t>
-      </w:r>
-      <w:proofErr w:type="spellEnd"/>
-      <w:r>
-        <w:rPr>
-          <w:rFonts w:ascii="Times New Roman" w:eastAsia="Calibri" w:hAnsi="Times New Roman" w:cs="Times New Roman"/>
-          <w:sz w:val="18"/>
-          <w:szCs w:val="18"/>
-        </w:rPr>
-        <w:t xml:space="preserve"> form di </w:t>
-      </w:r>
-      <w:proofErr w:type="spellStart"/>
-      <w:r>
-        <w:rPr>
-          <w:rFonts w:ascii="Times New Roman" w:eastAsia="Calibri" w:hAnsi="Times New Roman" w:cs="Times New Roman"/>
-          <w:sz w:val="18"/>
-          <w:szCs w:val="18"/>
-        </w:rPr>
-        <w:t>nilai</w:t>
-      </w:r>
-      <w:proofErr w:type="spellEnd"/>
-      <w:r>
-        <w:rPr>
-          <w:rFonts w:ascii="Times New Roman" w:eastAsia="Calibri" w:hAnsi="Times New Roman" w:cs="Times New Roman"/>
-          <w:sz w:val="18"/>
-          <w:szCs w:val="18"/>
-        </w:rPr>
-        <w:t xml:space="preserve"> </w:t>
-      </w:r>
-      <w:proofErr w:type="spellStart"/>
-      <w:r>
-        <w:rPr>
-          <w:rFonts w:ascii="Times New Roman" w:eastAsia="Calibri" w:hAnsi="Times New Roman" w:cs="Times New Roman"/>
-          <w:sz w:val="18"/>
-          <w:szCs w:val="18"/>
-        </w:rPr>
-        <w:t>kembalikan</w:t>
-      </w:r>
-      <w:proofErr w:type="spellEnd"/>
-      <w:r>
-        <w:rPr>
-          <w:rFonts w:ascii="Times New Roman" w:eastAsia="Calibri" w:hAnsi="Times New Roman" w:cs="Times New Roman"/>
-          <w:sz w:val="18"/>
-          <w:szCs w:val="18"/>
-        </w:rPr>
-        <w:t xml:space="preserve"> </w:t>
-      </w:r>
-      <w:proofErr w:type="spellStart"/>
-      <w:r>
-        <w:rPr>
-          <w:rFonts w:ascii="Times New Roman" w:eastAsia="Calibri" w:hAnsi="Times New Roman" w:cs="Times New Roman"/>
-          <w:sz w:val="18"/>
-          <w:szCs w:val="18"/>
-        </w:rPr>
-        <w:t>ke</w:t>
-      </w:r>
-      <w:proofErr w:type="spellEnd"/>
-      <w:r>
-        <w:rPr>
-          <w:rFonts w:ascii="Times New Roman" w:eastAsia="Calibri" w:hAnsi="Times New Roman" w:cs="Times New Roman"/>
-          <w:sz w:val="18"/>
-          <w:szCs w:val="18"/>
-        </w:rPr>
-        <w:t xml:space="preserve"> admin </w:t>
-      </w:r>
-      <w:proofErr w:type="spellStart"/>
-      <w:r>
-        <w:rPr>
-          <w:rFonts w:ascii="Times New Roman" w:eastAsia="Calibri" w:hAnsi="Times New Roman" w:cs="Times New Roman"/>
-          <w:sz w:val="18"/>
-          <w:szCs w:val="18"/>
-        </w:rPr>
-        <w:t>lagi</w:t>
-      </w:r>
-      <w:proofErr w:type="spellEnd"/>
     </w:p>
     <w:p>
       <w:pPr>
@@ -1592,18 +960,8 @@
                 <w:sz w:val="24"/>
                 <w:szCs w:val="24"/>
               </w:rPr>
-              <w:t xml:space="preserve">Dosen </w:t>
-            </w:r>
-            <w:proofErr w:type="spellStart"/>
-            <w:r>
-              <w:rPr>
-                <w:rFonts w:ascii="Times New Roman" w:eastAsia="Calibri" w:hAnsi="Times New Roman" w:cs="Times New Roman"/>
-                <w:sz w:val="24"/>
-                <w:szCs w:val="24"/>
-              </w:rPr>
-              <w:t>Penguji</w:t>
-            </w:r>
-            <w:proofErr w:type="spellEnd"/>
+              <w:t>Dosen Penguji</w:t>
+            </w:r>
           </w:p>
         </w:tc>
         <w:tc>
@@ -1758,18 +1116,8 @@
                 <w:sz w:val="24"/>
                 <w:szCs w:val="24"/>
               </w:rPr>
-              <w:t xml:space="preserve">Nama </w:t>
-            </w:r>
-            <w:proofErr w:type="spellStart"/>
-            <w:r>
-              <w:rPr>
-                <w:rFonts w:ascii="Times New Roman" w:eastAsia="Calibri" w:hAnsi="Times New Roman" w:cs="Times New Roman"/>
-                <w:sz w:val="24"/>
-                <w:szCs w:val="24"/>
-              </w:rPr>
-              <w:t>Mahasiswa</w:t>
-            </w:r>
-            <w:proofErr w:type="spellEnd"/>
+              <w:t>Nama Mahasiswa</w:t>
+            </w:r>
           </w:p>
         </w:tc>
         <w:tc>
@@ -1816,25 +1164,7 @@
                 <w:sz w:val="24"/>
                 <w:szCs w:val="24"/>
               </w:rPr>
-              <w:t>{</w:t>
-            </w:r>
-            <w:proofErr w:type="spellStart"/>
-            <w:r>
-              <w:rPr>
-                <w:rFonts w:ascii="Times New Roman" w:eastAsia="Calibri" w:hAnsi="Times New Roman" w:cs="Times New Roman"/>
-                <w:sz w:val="24"/>
-                <w:szCs w:val="24"/>
-              </w:rPr>
-              <w:t>nama_mhs</w:t>
-            </w:r>
-            <w:proofErr w:type="spellEnd"/>
-            <w:r>
-              <w:rPr>
-                <w:rFonts w:ascii="Times New Roman" w:eastAsia="Calibri" w:hAnsi="Times New Roman" w:cs="Times New Roman"/>
-                <w:sz w:val="24"/>
-                <w:szCs w:val="24"/>
-              </w:rPr>
-              <w:t>}</w:t>
+              <w:t>{nama_mhs}</w:t>
             </w:r>
           </w:p>
         </w:tc>
@@ -1936,23 +1266,13 @@
                 <w:szCs w:val="24"/>
               </w:rPr>
             </w:pPr>
-            <w:proofErr w:type="spellStart"/>
-            <w:r>
-              <w:rPr>
-                <w:rFonts w:ascii="Times New Roman" w:eastAsia="Calibri" w:hAnsi="Times New Roman" w:cs="Times New Roman"/>
-                <w:sz w:val="24"/>
-                <w:szCs w:val="24"/>
-              </w:rPr>
-              <w:t>Judul</w:t>
-            </w:r>
-            <w:proofErr w:type="spellEnd"/>
-            <w:r>
-              <w:rPr>
-                <w:rFonts w:ascii="Times New Roman" w:eastAsia="Calibri" w:hAnsi="Times New Roman" w:cs="Times New Roman"/>
-                <w:sz w:val="24"/>
-                <w:szCs w:val="24"/>
-              </w:rPr>
-              <w:t xml:space="preserve"> KP</w:t>
+            <w:r>
+              <w:rPr>
+                <w:rFonts w:ascii="Times New Roman" w:eastAsia="Calibri" w:hAnsi="Times New Roman" w:cs="Times New Roman"/>
+                <w:sz w:val="24"/>
+                <w:szCs w:val="24"/>
+              </w:rPr>
+              <w:t>Judul KP</w:t>
             </w:r>
           </w:p>
         </w:tc>
@@ -2000,25 +1320,7 @@
                 <w:sz w:val="24"/>
                 <w:szCs w:val="24"/>
               </w:rPr>
-              <w:t>{</w:t>
-            </w:r>
-            <w:proofErr w:type="spellStart"/>
-            <w:r>
-              <w:rPr>
-                <w:rFonts w:ascii="Times New Roman" w:eastAsia="Calibri" w:hAnsi="Times New Roman" w:cs="Times New Roman"/>
-                <w:sz w:val="24"/>
-                <w:szCs w:val="24"/>
-              </w:rPr>
-              <w:t>judul_kp</w:t>
-            </w:r>
-            <w:proofErr w:type="spellEnd"/>
-            <w:r>
-              <w:rPr>
-                <w:rFonts w:ascii="Times New Roman" w:eastAsia="Calibri" w:hAnsi="Times New Roman" w:cs="Times New Roman"/>
-                <w:sz w:val="24"/>
-                <w:szCs w:val="24"/>
-              </w:rPr>
-              <w:t>}</w:t>
+              <w:t>{judul_kp}</w:t>
             </w:r>
           </w:p>
         </w:tc>
@@ -2038,23 +1340,13 @@
                 <w:szCs w:val="24"/>
               </w:rPr>
             </w:pPr>
-            <w:proofErr w:type="spellStart"/>
-            <w:r>
-              <w:rPr>
-                <w:rFonts w:ascii="Times New Roman" w:eastAsia="Calibri" w:hAnsi="Times New Roman" w:cs="Times New Roman"/>
-                <w:sz w:val="24"/>
-                <w:szCs w:val="24"/>
-              </w:rPr>
-              <w:t>Tanggal</w:t>
-            </w:r>
-            <w:proofErr w:type="spellEnd"/>
-            <w:r>
-              <w:rPr>
-                <w:rFonts w:ascii="Times New Roman" w:eastAsia="Calibri" w:hAnsi="Times New Roman" w:cs="Times New Roman"/>
-                <w:sz w:val="24"/>
-                <w:szCs w:val="24"/>
-              </w:rPr>
-              <w:t xml:space="preserve"> Seminar</w:t>
+            <w:r>
+              <w:rPr>
+                <w:rFonts w:ascii="Times New Roman" w:eastAsia="Calibri" w:hAnsi="Times New Roman" w:cs="Times New Roman"/>
+                <w:sz w:val="24"/>
+                <w:szCs w:val="24"/>
+              </w:rPr>
+              <w:t>Tanggal Seminar</w:t>
             </w:r>
           </w:p>
         </w:tc>
@@ -2102,25 +1394,7 @@
                 <w:sz w:val="24"/>
                 <w:szCs w:val="24"/>
               </w:rPr>
-              <w:t xml:space="preserve">{tgl_cetak}</w:t>
-            </w:r>
-            <w:proofErr w:type="spellStart"/>
-            <w:r>
-              <w:rPr>
-                <w:rFonts w:ascii="Times New Roman" w:eastAsia="Calibri" w:hAnsi="Times New Roman" w:cs="Times New Roman"/>
-                <w:sz w:val="24"/>
-                <w:szCs w:val="24"/>
-              </w:rPr>
-              <w:t xml:space="preserve"/>
-            </w:r>
-            <w:proofErr w:type="spellEnd"/>
-            <w:r>
-              <w:rPr>
-                <w:rFonts w:ascii="Times New Roman" w:eastAsia="Calibri" w:hAnsi="Times New Roman" w:cs="Times New Roman"/>
-                <w:sz w:val="24"/>
-                <w:szCs w:val="24"/>
-              </w:rPr>
-              <w:t xml:space="preserve"/>
+              <w:t>{tgl_cetak}</w:t>
             </w:r>
           </w:p>
         </w:tc>
@@ -2254,7 +1528,6 @@
                 <w:color w:val="000000"/>
               </w:rPr>
             </w:pPr>
-            <w:proofErr w:type="spellStart"/>
             <w:r>
               <w:rPr>
                 <w:rFonts w:ascii="Times New Roman" w:eastAsia="Times New Roman" w:hAnsi="Times New Roman" w:cs="Times New Roman"/>
@@ -2264,7 +1537,6 @@
               </w:rPr>
               <w:t>Cukup</w:t>
             </w:r>
-            <w:proofErr w:type="spellEnd"/>
           </w:p>
         </w:tc>
         <w:tc>
@@ -2403,7 +1675,6 @@
                 <w:color w:val="000000"/>
               </w:rPr>
             </w:pPr>
-            <w:proofErr w:type="spellStart"/>
             <w:r>
               <w:rPr>
                 <w:rFonts w:ascii="Times New Roman" w:eastAsia="Times New Roman" w:hAnsi="Times New Roman" w:cs="Times New Roman"/>
@@ -2411,29 +1682,8 @@
                 <w:bCs/>
                 <w:color w:val="000000"/>
               </w:rPr>
-              <w:t>Kriteria</w:t>
-            </w:r>
-            <w:proofErr w:type="spellEnd"/>
-            <w:r>
-              <w:rPr>
-                <w:rFonts w:ascii="Times New Roman" w:eastAsia="Times New Roman" w:hAnsi="Times New Roman" w:cs="Times New Roman"/>
-                <w:b/>
-                <w:bCs/>
-                <w:color w:val="000000"/>
-              </w:rPr>
-              <w:t xml:space="preserve"> </w:t>
-            </w:r>
-            <w:proofErr w:type="spellStart"/>
-            <w:r>
-              <w:rPr>
-                <w:rFonts w:ascii="Times New Roman" w:eastAsia="Times New Roman" w:hAnsi="Times New Roman" w:cs="Times New Roman"/>
-                <w:b/>
-                <w:bCs/>
-                <w:color w:val="000000"/>
-              </w:rPr>
-              <w:t>penilaian</w:t>
-            </w:r>
-            <w:proofErr w:type="spellEnd"/>
+              <w:t>Kriteria penilaian</w:t>
+            </w:r>
           </w:p>
         </w:tc>
         <w:tc>
@@ -2780,31 +2030,13 @@
                 <w:color w:val="000000"/>
               </w:rPr>
             </w:pPr>
-            <w:proofErr w:type="spellStart"/>
-            <w:r>
-              <w:rPr>
-                <w:rFonts w:ascii="Times New Roman" w:eastAsia="Times New Roman" w:hAnsi="Times New Roman" w:cs="Times New Roman"/>
-                <w:color w:val="000000"/>
-              </w:rPr>
-              <w:t>Substansi</w:t>
-            </w:r>
-            <w:proofErr w:type="spellEnd"/>
-            <w:r>
-              <w:rPr>
-                <w:rFonts w:ascii="Times New Roman" w:eastAsia="Times New Roman" w:hAnsi="Times New Roman" w:cs="Times New Roman"/>
-                <w:color w:val="000000"/>
-              </w:rPr>
-              <w:t xml:space="preserve"> </w:t>
-            </w:r>
-            <w:proofErr w:type="spellStart"/>
-            <w:r>
-              <w:rPr>
-                <w:rFonts w:ascii="Times New Roman" w:eastAsia="Times New Roman" w:hAnsi="Times New Roman" w:cs="Times New Roman"/>
-                <w:color w:val="000000"/>
-              </w:rPr>
-              <w:t>laporan</w:t>
-            </w:r>
-            <w:proofErr w:type="spellEnd"/>
+            <w:r>
+              <w:rPr>
+                <w:rFonts w:ascii="Times New Roman" w:eastAsia="Times New Roman" w:hAnsi="Times New Roman" w:cs="Times New Roman"/>
+                <w:color w:val="000000"/>
+              </w:rPr>
+              <w:t>Substansi laporan</w:t>
+            </w:r>
           </w:p>
         </w:tc>
         <w:tc>
@@ -2826,7 +2058,6 @@
                 <w:color w:val="000000"/>
               </w:rPr>
             </w:pPr>
-            <w:proofErr w:type="spellStart"/>
             <w:r>
               <w:rPr>
                 <w:rFonts w:ascii="Times New Roman" w:eastAsia="Times New Roman" w:hAnsi="Times New Roman" w:cs="Times New Roman"/>
@@ -2834,7 +2065,6 @@
               </w:rPr>
               <w:t>Originalitas</w:t>
             </w:r>
-            <w:proofErr w:type="spellEnd"/>
           </w:p>
         </w:tc>
         <w:tc>
@@ -3002,103 +2232,7 @@
                 <w:rFonts w:ascii="Times New Roman" w:eastAsia="Times New Roman" w:hAnsi="Times New Roman" w:cs="Times New Roman"/>
                 <w:color w:val="000000"/>
               </w:rPr>
-              <w:t xml:space="preserve">Materi </w:t>
-            </w:r>
-            <w:proofErr w:type="spellStart"/>
-            <w:r>
-              <w:rPr>
-                <w:rFonts w:ascii="Times New Roman" w:eastAsia="Times New Roman" w:hAnsi="Times New Roman" w:cs="Times New Roman"/>
-                <w:color w:val="000000"/>
-              </w:rPr>
-              <w:t>penyajian</w:t>
-            </w:r>
-            <w:proofErr w:type="spellEnd"/>
-            <w:r>
-              <w:rPr>
-                <w:rFonts w:ascii="Times New Roman" w:eastAsia="Times New Roman" w:hAnsi="Times New Roman" w:cs="Times New Roman"/>
-                <w:color w:val="000000"/>
-              </w:rPr>
-              <w:t xml:space="preserve">, </w:t>
-            </w:r>
-            <w:proofErr w:type="spellStart"/>
-            <w:r>
-              <w:rPr>
-                <w:rFonts w:ascii="Times New Roman" w:eastAsia="Times New Roman" w:hAnsi="Times New Roman" w:cs="Times New Roman"/>
-                <w:color w:val="000000"/>
-              </w:rPr>
-              <w:t>gambar</w:t>
-            </w:r>
-            <w:proofErr w:type="spellEnd"/>
-            <w:r>
-              <w:rPr>
-                <w:rFonts w:ascii="Times New Roman" w:eastAsia="Times New Roman" w:hAnsi="Times New Roman" w:cs="Times New Roman"/>
-                <w:color w:val="000000"/>
-              </w:rPr>
-              <w:t xml:space="preserve"> dan </w:t>
-            </w:r>
-            <w:proofErr w:type="spellStart"/>
-            <w:r>
-              <w:rPr>
-                <w:rFonts w:ascii="Times New Roman" w:eastAsia="Times New Roman" w:hAnsi="Times New Roman" w:cs="Times New Roman"/>
-                <w:color w:val="000000"/>
-              </w:rPr>
-              <w:t>tabel</w:t>
-            </w:r>
-            <w:proofErr w:type="spellEnd"/>
-            <w:r>
-              <w:rPr>
-                <w:rFonts w:ascii="Times New Roman" w:eastAsia="Times New Roman" w:hAnsi="Times New Roman" w:cs="Times New Roman"/>
-                <w:color w:val="000000"/>
-              </w:rPr>
-              <w:t xml:space="preserve"> </w:t>
-            </w:r>
-            <w:proofErr w:type="spellStart"/>
-            <w:r>
-              <w:rPr>
-                <w:rFonts w:ascii="Times New Roman" w:eastAsia="Times New Roman" w:hAnsi="Times New Roman" w:cs="Times New Roman"/>
-                <w:color w:val="000000"/>
-              </w:rPr>
-              <w:t>sesuai</w:t>
-            </w:r>
-            <w:proofErr w:type="spellEnd"/>
-            <w:r>
-              <w:rPr>
-                <w:rFonts w:ascii="Times New Roman" w:eastAsia="Times New Roman" w:hAnsi="Times New Roman" w:cs="Times New Roman"/>
-                <w:color w:val="000000"/>
-              </w:rPr>
-              <w:t xml:space="preserve"> </w:t>
-            </w:r>
-            <w:proofErr w:type="spellStart"/>
-            <w:r>
-              <w:rPr>
-                <w:rFonts w:ascii="Times New Roman" w:eastAsia="Times New Roman" w:hAnsi="Times New Roman" w:cs="Times New Roman"/>
-                <w:color w:val="000000"/>
-              </w:rPr>
-              <w:t>dengan</w:t>
-            </w:r>
-            <w:proofErr w:type="spellEnd"/>
-            <w:r>
-              <w:rPr>
-                <w:rFonts w:ascii="Times New Roman" w:eastAsia="Times New Roman" w:hAnsi="Times New Roman" w:cs="Times New Roman"/>
-                <w:color w:val="000000"/>
-              </w:rPr>
-              <w:t xml:space="preserve"> </w:t>
-            </w:r>
-            <w:proofErr w:type="spellStart"/>
-            <w:r>
-              <w:rPr>
-                <w:rFonts w:ascii="Times New Roman" w:eastAsia="Times New Roman" w:hAnsi="Times New Roman" w:cs="Times New Roman"/>
-                <w:color w:val="000000"/>
-              </w:rPr>
-              <w:t>topik</w:t>
-            </w:r>
-            <w:proofErr w:type="spellEnd"/>
-            <w:r>
-              <w:rPr>
-                <w:rFonts w:ascii="Times New Roman" w:eastAsia="Times New Roman" w:hAnsi="Times New Roman" w:cs="Times New Roman"/>
-                <w:color w:val="000000"/>
-              </w:rPr>
-              <w:t xml:space="preserve"> KP</w:t>
+              <w:t>Materi penyajian, gambar dan tabel sesuai dengan topik KP</w:t>
             </w:r>
           </w:p>
         </w:tc>
@@ -3261,37 +2395,12 @@
                 <w:color w:val="000000"/>
               </w:rPr>
             </w:pPr>
-            <w:proofErr w:type="spellStart"/>
-            <w:r>
-              <w:rPr>
-                <w:rFonts w:ascii="Times New Roman" w:eastAsia="Times New Roman" w:hAnsi="Times New Roman" w:cs="Times New Roman"/>
-                <w:color w:val="000000"/>
-              </w:rPr>
-              <w:t>Kelengkapan</w:t>
-            </w:r>
-            <w:proofErr w:type="spellEnd"/>
-            <w:r>
-              <w:rPr>
-                <w:rFonts w:ascii="Times New Roman" w:eastAsia="Times New Roman" w:hAnsi="Times New Roman" w:cs="Times New Roman"/>
-                <w:color w:val="000000"/>
-              </w:rPr>
-              <w:t xml:space="preserve"> dan </w:t>
-            </w:r>
-            <w:proofErr w:type="spellStart"/>
-            <w:r>
-              <w:rPr>
-                <w:rFonts w:ascii="Times New Roman" w:eastAsia="Times New Roman" w:hAnsi="Times New Roman" w:cs="Times New Roman"/>
-                <w:color w:val="000000"/>
-              </w:rPr>
-              <w:t>pengolahan</w:t>
-            </w:r>
-            <w:proofErr w:type="spellEnd"/>
-            <w:r>
-              <w:rPr>
-                <w:rFonts w:ascii="Times New Roman" w:eastAsia="Times New Roman" w:hAnsi="Times New Roman" w:cs="Times New Roman"/>
-                <w:color w:val="000000"/>
-              </w:rPr>
-              <w:t xml:space="preserve"> data</w:t>
+            <w:r>
+              <w:rPr>
+                <w:rFonts w:ascii="Times New Roman" w:eastAsia="Times New Roman" w:hAnsi="Times New Roman" w:cs="Times New Roman"/>
+                <w:color w:val="000000"/>
+              </w:rPr>
+              <w:t>Kelengkapan dan pengolahan data</w:t>
             </w:r>
           </w:p>
         </w:tc>
@@ -3455,47 +2564,13 @@
                 <w:color w:val="000000"/>
               </w:rPr>
             </w:pPr>
-            <w:proofErr w:type="spellStart"/>
-            <w:r>
-              <w:rPr>
-                <w:rFonts w:ascii="Times New Roman" w:eastAsia="Times New Roman" w:hAnsi="Times New Roman" w:cs="Times New Roman"/>
-                <w:color w:val="000000"/>
-              </w:rPr>
-              <w:t>Ketajaman</w:t>
-            </w:r>
-            <w:proofErr w:type="spellEnd"/>
-            <w:r>
-              <w:rPr>
-                <w:rFonts w:ascii="Times New Roman" w:eastAsia="Times New Roman" w:hAnsi="Times New Roman" w:cs="Times New Roman"/>
-                <w:color w:val="000000"/>
-              </w:rPr>
-              <w:t xml:space="preserve"> </w:t>
-            </w:r>
-            <w:proofErr w:type="spellStart"/>
-            <w:r>
-              <w:rPr>
-                <w:rFonts w:ascii="Times New Roman" w:eastAsia="Times New Roman" w:hAnsi="Times New Roman" w:cs="Times New Roman"/>
-                <w:color w:val="000000"/>
-              </w:rPr>
-              <w:t>analisis</w:t>
-            </w:r>
-            <w:proofErr w:type="spellEnd"/>
-            <w:r>
-              <w:rPr>
-                <w:rFonts w:ascii="Times New Roman" w:eastAsia="Times New Roman" w:hAnsi="Times New Roman" w:cs="Times New Roman"/>
-                <w:color w:val="000000"/>
-              </w:rPr>
-              <w:t xml:space="preserve"> dan </w:t>
-            </w:r>
-            <w:proofErr w:type="spellStart"/>
-            <w:r>
-              <w:rPr>
-                <w:rFonts w:ascii="Times New Roman" w:eastAsia="Times New Roman" w:hAnsi="Times New Roman" w:cs="Times New Roman"/>
-                <w:color w:val="000000"/>
-              </w:rPr>
-              <w:t>pembahasan</w:t>
-            </w:r>
-            <w:proofErr w:type="spellEnd"/>
+            <w:r>
+              <w:rPr>
+                <w:rFonts w:ascii="Times New Roman" w:eastAsia="Times New Roman" w:hAnsi="Times New Roman" w:cs="Times New Roman"/>
+                <w:color w:val="000000"/>
+              </w:rPr>
+              <w:t>Ketajaman analisis dan pembahasan</w:t>
+            </w:r>
           </w:p>
         </w:tc>
         <w:tc>
@@ -3638,21 +2713,12 @@
                 <w:color w:val="000000"/>
               </w:rPr>
             </w:pPr>
-            <w:proofErr w:type="spellStart"/>
-            <w:r>
-              <w:rPr>
-                <w:rFonts w:ascii="Times New Roman" w:eastAsia="Times New Roman" w:hAnsi="Times New Roman" w:cs="Times New Roman"/>
-                <w:color w:val="000000"/>
-              </w:rPr>
-              <w:t>Penguasaan</w:t>
-            </w:r>
-            <w:proofErr w:type="spellEnd"/>
-            <w:r>
-              <w:rPr>
-                <w:rFonts w:ascii="Times New Roman" w:eastAsia="Times New Roman" w:hAnsi="Times New Roman" w:cs="Times New Roman"/>
-                <w:color w:val="000000"/>
-              </w:rPr>
-              <w:t xml:space="preserve"> Materi</w:t>
+            <w:r>
+              <w:rPr>
+                <w:rFonts w:ascii="Times New Roman" w:eastAsia="Times New Roman" w:hAnsi="Times New Roman" w:cs="Times New Roman"/>
+                <w:color w:val="000000"/>
+              </w:rPr>
+              <w:t>Penguasaan Materi</w:t>
             </w:r>
           </w:p>
         </w:tc>
@@ -3675,85 +2741,12 @@
                 <w:color w:val="000000"/>
               </w:rPr>
             </w:pPr>
-            <w:proofErr w:type="spellStart"/>
-            <w:r>
-              <w:rPr>
-                <w:rFonts w:ascii="Times New Roman" w:eastAsia="Times New Roman" w:hAnsi="Times New Roman" w:cs="Times New Roman"/>
-                <w:color w:val="000000"/>
-              </w:rPr>
-              <w:t>Penguasaan</w:t>
-            </w:r>
-            <w:proofErr w:type="spellEnd"/>
-            <w:r>
-              <w:rPr>
-                <w:rFonts w:ascii="Times New Roman" w:eastAsia="Times New Roman" w:hAnsi="Times New Roman" w:cs="Times New Roman"/>
-                <w:color w:val="000000"/>
-              </w:rPr>
-              <w:t xml:space="preserve"> </w:t>
-            </w:r>
-            <w:proofErr w:type="spellStart"/>
-            <w:r>
-              <w:rPr>
-                <w:rFonts w:ascii="Times New Roman" w:eastAsia="Times New Roman" w:hAnsi="Times New Roman" w:cs="Times New Roman"/>
-                <w:color w:val="000000"/>
-              </w:rPr>
-              <w:t>kajian</w:t>
-            </w:r>
-            <w:proofErr w:type="spellEnd"/>
-            <w:r>
-              <w:rPr>
-                <w:rFonts w:ascii="Times New Roman" w:eastAsia="Times New Roman" w:hAnsi="Times New Roman" w:cs="Times New Roman"/>
-                <w:color w:val="000000"/>
-              </w:rPr>
-              <w:t xml:space="preserve"> </w:t>
-            </w:r>
-            <w:proofErr w:type="spellStart"/>
-            <w:r>
-              <w:rPr>
-                <w:rFonts w:ascii="Times New Roman" w:eastAsia="Times New Roman" w:hAnsi="Times New Roman" w:cs="Times New Roman"/>
-                <w:color w:val="000000"/>
-              </w:rPr>
-              <w:t>pustaka</w:t>
-            </w:r>
-            <w:proofErr w:type="spellEnd"/>
-            <w:r>
-              <w:rPr>
-                <w:rFonts w:ascii="Times New Roman" w:eastAsia="Times New Roman" w:hAnsi="Times New Roman" w:cs="Times New Roman"/>
-                <w:color w:val="000000"/>
-              </w:rPr>
-              <w:t xml:space="preserve"> </w:t>
-            </w:r>
-            <w:proofErr w:type="spellStart"/>
-            <w:r>
-              <w:rPr>
-                <w:rFonts w:ascii="Times New Roman" w:eastAsia="Times New Roman" w:hAnsi="Times New Roman" w:cs="Times New Roman"/>
-                <w:color w:val="000000"/>
-              </w:rPr>
-              <w:t>sesuai</w:t>
-            </w:r>
-            <w:proofErr w:type="spellEnd"/>
-            <w:r>
-              <w:rPr>
-                <w:rFonts w:ascii="Times New Roman" w:eastAsia="Times New Roman" w:hAnsi="Times New Roman" w:cs="Times New Roman"/>
-                <w:color w:val="000000"/>
-              </w:rPr>
-              <w:t xml:space="preserve"> </w:t>
-            </w:r>
-            <w:proofErr w:type="spellStart"/>
-            <w:r>
-              <w:rPr>
-                <w:rFonts w:ascii="Times New Roman" w:eastAsia="Times New Roman" w:hAnsi="Times New Roman" w:cs="Times New Roman"/>
-                <w:color w:val="000000"/>
-              </w:rPr>
-              <w:t>topik</w:t>
-            </w:r>
-            <w:proofErr w:type="spellEnd"/>
-            <w:r>
-              <w:rPr>
-                <w:rFonts w:ascii="Times New Roman" w:eastAsia="Times New Roman" w:hAnsi="Times New Roman" w:cs="Times New Roman"/>
-                <w:color w:val="000000"/>
-              </w:rPr>
-              <w:t xml:space="preserve"> KP</w:t>
+            <w:r>
+              <w:rPr>
+                <w:rFonts w:ascii="Times New Roman" w:eastAsia="Times New Roman" w:hAnsi="Times New Roman" w:cs="Times New Roman"/>
+                <w:color w:val="000000"/>
+              </w:rPr>
+              <w:t>Penguasaan kajian pustaka sesuai topik KP</w:t>
             </w:r>
           </w:p>
         </w:tc>
@@ -3918,37 +2911,12 @@
                 <w:color w:val="000000"/>
               </w:rPr>
             </w:pPr>
-            <w:proofErr w:type="spellStart"/>
-            <w:r>
-              <w:rPr>
-                <w:rFonts w:ascii="Times New Roman" w:eastAsia="Times New Roman" w:hAnsi="Times New Roman" w:cs="Times New Roman"/>
-                <w:color w:val="000000"/>
-              </w:rPr>
-              <w:t>Penguasaan</w:t>
-            </w:r>
-            <w:proofErr w:type="spellEnd"/>
-            <w:r>
-              <w:rPr>
-                <w:rFonts w:ascii="Times New Roman" w:eastAsia="Times New Roman" w:hAnsi="Times New Roman" w:cs="Times New Roman"/>
-                <w:color w:val="000000"/>
-              </w:rPr>
-              <w:t xml:space="preserve"> </w:t>
-            </w:r>
-            <w:proofErr w:type="spellStart"/>
-            <w:r>
-              <w:rPr>
-                <w:rFonts w:ascii="Times New Roman" w:eastAsia="Times New Roman" w:hAnsi="Times New Roman" w:cs="Times New Roman"/>
-                <w:color w:val="000000"/>
-              </w:rPr>
-              <w:t>pelaksanaan</w:t>
-            </w:r>
-            <w:proofErr w:type="spellEnd"/>
-            <w:r>
-              <w:rPr>
-                <w:rFonts w:ascii="Times New Roman" w:eastAsia="Times New Roman" w:hAnsi="Times New Roman" w:cs="Times New Roman"/>
-                <w:color w:val="000000"/>
-              </w:rPr>
-              <w:t xml:space="preserve"> KP</w:t>
+            <w:r>
+              <w:rPr>
+                <w:rFonts w:ascii="Times New Roman" w:eastAsia="Times New Roman" w:hAnsi="Times New Roman" w:cs="Times New Roman"/>
+                <w:color w:val="000000"/>
+              </w:rPr>
+              <w:t>Penguasaan pelaksanaan KP</w:t>
             </w:r>
           </w:p>
         </w:tc>
@@ -4113,47 +3081,13 @@
                 <w:color w:val="000000"/>
               </w:rPr>
             </w:pPr>
-            <w:proofErr w:type="spellStart"/>
-            <w:r>
-              <w:rPr>
-                <w:rFonts w:ascii="Times New Roman" w:eastAsia="Times New Roman" w:hAnsi="Times New Roman" w:cs="Times New Roman"/>
-                <w:color w:val="000000"/>
-              </w:rPr>
-              <w:t>Kemampuan</w:t>
-            </w:r>
-            <w:proofErr w:type="spellEnd"/>
-            <w:r>
-              <w:rPr>
-                <w:rFonts w:ascii="Times New Roman" w:eastAsia="Times New Roman" w:hAnsi="Times New Roman" w:cs="Times New Roman"/>
-                <w:color w:val="000000"/>
-              </w:rPr>
-              <w:t xml:space="preserve"> </w:t>
-            </w:r>
-            <w:proofErr w:type="spellStart"/>
-            <w:r>
-              <w:rPr>
-                <w:rFonts w:ascii="Times New Roman" w:eastAsia="Times New Roman" w:hAnsi="Times New Roman" w:cs="Times New Roman"/>
-                <w:color w:val="000000"/>
-              </w:rPr>
-              <w:t>menjawab</w:t>
-            </w:r>
-            <w:proofErr w:type="spellEnd"/>
-            <w:r>
-              <w:rPr>
-                <w:rFonts w:ascii="Times New Roman" w:eastAsia="Times New Roman" w:hAnsi="Times New Roman" w:cs="Times New Roman"/>
-                <w:color w:val="000000"/>
-              </w:rPr>
-              <w:t xml:space="preserve"> </w:t>
-            </w:r>
-            <w:proofErr w:type="spellStart"/>
-            <w:r>
-              <w:rPr>
-                <w:rFonts w:ascii="Times New Roman" w:eastAsia="Times New Roman" w:hAnsi="Times New Roman" w:cs="Times New Roman"/>
-                <w:color w:val="000000"/>
-              </w:rPr>
-              <w:t>pertanyaan</w:t>
-            </w:r>
-            <w:proofErr w:type="spellEnd"/>
+            <w:r>
+              <w:rPr>
+                <w:rFonts w:ascii="Times New Roman" w:eastAsia="Times New Roman" w:hAnsi="Times New Roman" w:cs="Times New Roman"/>
+                <w:color w:val="000000"/>
+              </w:rPr>
+              <w:t>Kemampuan menjawab pertanyaan</w:t>
+            </w:r>
           </w:p>
         </w:tc>
         <w:tc>
@@ -4366,7 +3300,6 @@
                 <w:color w:val="000000"/>
               </w:rPr>
             </w:pPr>
-            <w:proofErr w:type="spellStart"/>
             <w:r>
               <w:rPr>
                 <w:rFonts w:ascii="Times New Roman" w:eastAsia="Times New Roman" w:hAnsi="Times New Roman" w:cs="Times New Roman"/>
@@ -4376,7 +3309,6 @@
               </w:rPr>
               <w:t>Cukup</w:t>
             </w:r>
-            <w:proofErr w:type="spellEnd"/>
           </w:p>
         </w:tc>
         <w:tc>
@@ -4494,7 +3426,6 @@
                 <w:color w:val="000000"/>
               </w:rPr>
             </w:pPr>
-            <w:proofErr w:type="spellStart"/>
             <w:r>
               <w:rPr>
                 <w:rFonts w:ascii="Times New Roman" w:eastAsia="Calibri" w:hAnsi="Times New Roman" w:cs="Times New Roman"/>
@@ -4502,29 +3433,8 @@
                 <w:sz w:val="20"/>
                 <w:szCs w:val="20"/>
               </w:rPr>
-              <w:t>Kriteria</w:t>
-            </w:r>
-            <w:proofErr w:type="spellEnd"/>
-            <w:r>
-              <w:rPr>
-                <w:rFonts w:ascii="Times New Roman" w:eastAsia="Calibri" w:hAnsi="Times New Roman" w:cs="Times New Roman"/>
-                <w:b/>
-                <w:sz w:val="20"/>
-                <w:szCs w:val="20"/>
-              </w:rPr>
-              <w:t xml:space="preserve"> </w:t>
-            </w:r>
-            <w:proofErr w:type="spellStart"/>
-            <w:r>
-              <w:rPr>
-                <w:rFonts w:ascii="Times New Roman" w:eastAsia="Calibri" w:hAnsi="Times New Roman" w:cs="Times New Roman"/>
-                <w:b/>
-                <w:sz w:val="20"/>
-                <w:szCs w:val="20"/>
-              </w:rPr>
-              <w:t>Penilaian</w:t>
-            </w:r>
-            <w:proofErr w:type="spellEnd"/>
+              <w:t>Kriteria Penilaian</w:t>
+            </w:r>
           </w:p>
         </w:tc>
         <w:tc>
@@ -4704,33 +3614,8 @@
                 <w:rFonts w:ascii="Times New Roman" w:eastAsia="Times New Roman" w:hAnsi="Times New Roman" w:cs="Times New Roman"/>
                 <w:color w:val="000000"/>
               </w:rPr>
-              <w:t xml:space="preserve">Tata </w:t>
-            </w:r>
-            <w:proofErr w:type="spellStart"/>
-            <w:r>
-              <w:rPr>
-                <w:rFonts w:ascii="Times New Roman" w:eastAsia="Times New Roman" w:hAnsi="Times New Roman" w:cs="Times New Roman"/>
-                <w:color w:val="000000"/>
-              </w:rPr>
-              <w:t>Penulisan</w:t>
-            </w:r>
-            <w:proofErr w:type="spellEnd"/>
-            <w:r>
-              <w:rPr>
-                <w:rFonts w:ascii="Times New Roman" w:eastAsia="Times New Roman" w:hAnsi="Times New Roman" w:cs="Times New Roman"/>
-                <w:color w:val="000000"/>
-              </w:rPr>
-              <w:t xml:space="preserve"> Karya </w:t>
-            </w:r>
-            <w:proofErr w:type="spellStart"/>
-            <w:r>
-              <w:rPr>
-                <w:rFonts w:ascii="Times New Roman" w:eastAsia="Times New Roman" w:hAnsi="Times New Roman" w:cs="Times New Roman"/>
-                <w:color w:val="000000"/>
-              </w:rPr>
-              <w:t>Ilmiah</w:t>
-            </w:r>
-            <w:proofErr w:type="spellEnd"/>
+              <w:t>Tata Penulisan Karya Ilmiah</w:t>
+            </w:r>
           </w:p>
         </w:tc>
         <w:tc>
@@ -4752,63 +3637,13 @@
                 <w:color w:val="000000"/>
               </w:rPr>
             </w:pPr>
-            <w:proofErr w:type="spellStart"/>
-            <w:r>
-              <w:rPr>
-                <w:rFonts w:ascii="Times New Roman" w:eastAsia="Times New Roman" w:hAnsi="Times New Roman" w:cs="Times New Roman"/>
-                <w:color w:val="000000"/>
-              </w:rPr>
-              <w:t>Ketaatan</w:t>
-            </w:r>
-            <w:proofErr w:type="spellEnd"/>
-            <w:r>
-              <w:rPr>
-                <w:rFonts w:ascii="Times New Roman" w:eastAsia="Times New Roman" w:hAnsi="Times New Roman" w:cs="Times New Roman"/>
-                <w:color w:val="000000"/>
-              </w:rPr>
-              <w:t xml:space="preserve"> </w:t>
-            </w:r>
-            <w:proofErr w:type="spellStart"/>
-            <w:r>
-              <w:rPr>
-                <w:rFonts w:ascii="Times New Roman" w:eastAsia="Times New Roman" w:hAnsi="Times New Roman" w:cs="Times New Roman"/>
-                <w:color w:val="000000"/>
-              </w:rPr>
-              <w:t>terhadap</w:t>
-            </w:r>
-            <w:proofErr w:type="spellEnd"/>
-            <w:r>
-              <w:rPr>
-                <w:rFonts w:ascii="Times New Roman" w:eastAsia="Times New Roman" w:hAnsi="Times New Roman" w:cs="Times New Roman"/>
-                <w:color w:val="000000"/>
-              </w:rPr>
-              <w:t xml:space="preserve"> format dan </w:t>
-            </w:r>
-            <w:proofErr w:type="spellStart"/>
-            <w:r>
-              <w:rPr>
-                <w:rFonts w:ascii="Times New Roman" w:eastAsia="Times New Roman" w:hAnsi="Times New Roman" w:cs="Times New Roman"/>
-                <w:color w:val="000000"/>
-              </w:rPr>
-              <w:t>sistematika</w:t>
-            </w:r>
-            <w:proofErr w:type="spellEnd"/>
-            <w:r>
-              <w:rPr>
-                <w:rFonts w:ascii="Times New Roman" w:eastAsia="Times New Roman" w:hAnsi="Times New Roman" w:cs="Times New Roman"/>
-                <w:color w:val="000000"/>
-              </w:rPr>
-              <w:t xml:space="preserve"> </w:t>
-            </w:r>
-            <w:proofErr w:type="spellStart"/>
-            <w:r>
-              <w:rPr>
-                <w:rFonts w:ascii="Times New Roman" w:eastAsia="Times New Roman" w:hAnsi="Times New Roman" w:cs="Times New Roman"/>
-                <w:color w:val="000000"/>
-              </w:rPr>
-              <w:t>penulisan</w:t>
-            </w:r>
-            <w:proofErr w:type="spellEnd"/>
+            <w:r>
+              <w:rPr>
+                <w:rFonts w:ascii="Times New Roman" w:eastAsia="Times New Roman" w:hAnsi="Times New Roman" w:cs="Times New Roman"/>
+                <w:color w:val="000000"/>
+              </w:rPr>
+              <w:t>Ketaatan terhadap format dan sistematika penulisan</w:t>
+            </w:r>
           </w:p>
         </w:tc>
         <w:tc>
@@ -4972,63 +3807,13 @@
                 <w:color w:val="000000"/>
               </w:rPr>
             </w:pPr>
-            <w:proofErr w:type="spellStart"/>
-            <w:r>
-              <w:rPr>
-                <w:rFonts w:ascii="Times New Roman" w:eastAsia="Times New Roman" w:hAnsi="Times New Roman" w:cs="Times New Roman"/>
-                <w:color w:val="000000"/>
-              </w:rPr>
-              <w:t>Kaidah</w:t>
-            </w:r>
-            <w:proofErr w:type="spellEnd"/>
-            <w:r>
-              <w:rPr>
-                <w:rFonts w:ascii="Times New Roman" w:eastAsia="Times New Roman" w:hAnsi="Times New Roman" w:cs="Times New Roman"/>
-                <w:color w:val="000000"/>
-              </w:rPr>
-              <w:t xml:space="preserve"> </w:t>
-            </w:r>
-            <w:proofErr w:type="spellStart"/>
-            <w:r>
-              <w:rPr>
-                <w:rFonts w:ascii="Times New Roman" w:eastAsia="Times New Roman" w:hAnsi="Times New Roman" w:cs="Times New Roman"/>
-                <w:color w:val="000000"/>
-              </w:rPr>
-              <w:t>penulisan</w:t>
-            </w:r>
-            <w:proofErr w:type="spellEnd"/>
-            <w:r>
-              <w:rPr>
-                <w:rFonts w:ascii="Times New Roman" w:eastAsia="Times New Roman" w:hAnsi="Times New Roman" w:cs="Times New Roman"/>
-                <w:color w:val="000000"/>
-              </w:rPr>
-              <w:t xml:space="preserve"> </w:t>
-            </w:r>
-            <w:proofErr w:type="spellStart"/>
-            <w:r>
-              <w:rPr>
-                <w:rFonts w:ascii="Times New Roman" w:eastAsia="Times New Roman" w:hAnsi="Times New Roman" w:cs="Times New Roman"/>
-                <w:color w:val="000000"/>
-              </w:rPr>
-              <w:t>karya</w:t>
-            </w:r>
-            <w:proofErr w:type="spellEnd"/>
-            <w:r>
-              <w:rPr>
-                <w:rFonts w:ascii="Times New Roman" w:eastAsia="Times New Roman" w:hAnsi="Times New Roman" w:cs="Times New Roman"/>
-                <w:color w:val="000000"/>
-              </w:rPr>
-              <w:t xml:space="preserve"> </w:t>
-            </w:r>
-            <w:proofErr w:type="spellStart"/>
-            <w:r>
-              <w:rPr>
-                <w:rFonts w:ascii="Times New Roman" w:eastAsia="Times New Roman" w:hAnsi="Times New Roman" w:cs="Times New Roman"/>
-                <w:color w:val="000000"/>
-              </w:rPr>
-              <w:t>ilmiah</w:t>
-            </w:r>
-            <w:proofErr w:type="spellEnd"/>
+            <w:r>
+              <w:rPr>
+                <w:rFonts w:ascii="Times New Roman" w:eastAsia="Times New Roman" w:hAnsi="Times New Roman" w:cs="Times New Roman"/>
+                <w:color w:val="000000"/>
+              </w:rPr>
+              <w:t>Kaidah penulisan karya ilmiah</w:t>
+            </w:r>
           </w:p>
         </w:tc>
         <w:tc>
@@ -5192,79 +3977,13 @@
                 <w:color w:val="000000"/>
               </w:rPr>
             </w:pPr>
-            <w:proofErr w:type="spellStart"/>
-            <w:r>
-              <w:rPr>
-                <w:rFonts w:ascii="Times New Roman" w:eastAsia="Times New Roman" w:hAnsi="Times New Roman" w:cs="Times New Roman"/>
-                <w:color w:val="000000"/>
-              </w:rPr>
-              <w:t>Ketaatan</w:t>
-            </w:r>
-            <w:proofErr w:type="spellEnd"/>
-            <w:r>
-              <w:rPr>
-                <w:rFonts w:ascii="Times New Roman" w:eastAsia="Times New Roman" w:hAnsi="Times New Roman" w:cs="Times New Roman"/>
-                <w:color w:val="000000"/>
-              </w:rPr>
-              <w:t xml:space="preserve"> </w:t>
-            </w:r>
-            <w:proofErr w:type="spellStart"/>
-            <w:r>
-              <w:rPr>
-                <w:rFonts w:ascii="Times New Roman" w:eastAsia="Times New Roman" w:hAnsi="Times New Roman" w:cs="Times New Roman"/>
-                <w:color w:val="000000"/>
-              </w:rPr>
-              <w:t>terhadap</w:t>
-            </w:r>
-            <w:proofErr w:type="spellEnd"/>
-            <w:r>
-              <w:rPr>
-                <w:rFonts w:ascii="Times New Roman" w:eastAsia="Times New Roman" w:hAnsi="Times New Roman" w:cs="Times New Roman"/>
-                <w:color w:val="000000"/>
-              </w:rPr>
-              <w:t xml:space="preserve"> </w:t>
-            </w:r>
-            <w:proofErr w:type="spellStart"/>
-            <w:r>
-              <w:rPr>
-                <w:rFonts w:ascii="Times New Roman" w:eastAsia="Times New Roman" w:hAnsi="Times New Roman" w:cs="Times New Roman"/>
-                <w:color w:val="000000"/>
-              </w:rPr>
-              <w:t>penulisan</w:t>
-            </w:r>
-            <w:proofErr w:type="spellEnd"/>
-            <w:r>
-              <w:rPr>
-                <w:rFonts w:ascii="Times New Roman" w:eastAsia="Times New Roman" w:hAnsi="Times New Roman" w:cs="Times New Roman"/>
-                <w:color w:val="000000"/>
-              </w:rPr>
-              <w:t xml:space="preserve"> </w:t>
-            </w:r>
-            <w:proofErr w:type="spellStart"/>
-            <w:r>
-              <w:rPr>
-                <w:rFonts w:ascii="Times New Roman" w:eastAsia="Times New Roman" w:hAnsi="Times New Roman" w:cs="Times New Roman"/>
-                <w:color w:val="000000"/>
-              </w:rPr>
-              <w:t>sumber</w:t>
-            </w:r>
-            <w:proofErr w:type="spellEnd"/>
-            <w:r>
-              <w:rPr>
-                <w:rFonts w:ascii="Times New Roman" w:eastAsia="Times New Roman" w:hAnsi="Times New Roman" w:cs="Times New Roman"/>
-                <w:color w:val="000000"/>
-              </w:rPr>
-              <w:t xml:space="preserve"> </w:t>
-            </w:r>
-            <w:proofErr w:type="spellStart"/>
-            <w:r>
-              <w:rPr>
-                <w:rFonts w:ascii="Times New Roman" w:eastAsia="Times New Roman" w:hAnsi="Times New Roman" w:cs="Times New Roman"/>
-                <w:color w:val="000000"/>
-              </w:rPr>
-              <w:t>acuan</w:t>
-            </w:r>
-            <w:proofErr w:type="spellEnd"/>
+            <w:r>
+              <w:rPr>
+                <w:rFonts w:ascii="Times New Roman" w:eastAsia="Times New Roman" w:hAnsi="Times New Roman" w:cs="Times New Roman"/>
+                <w:color w:val="000000"/>
+              </w:rPr>
+              <w:t>Ketaatan terhadap penulisan sumber acuan</w:t>
+            </w:r>
           </w:p>
         </w:tc>
         <w:tc>
@@ -5413,17 +4132,8 @@
                 <w:rFonts w:ascii="Times New Roman" w:eastAsia="Times New Roman" w:hAnsi="Times New Roman" w:cs="Times New Roman"/>
                 <w:color w:val="000000"/>
               </w:rPr>
-              <w:t xml:space="preserve">Metode </w:t>
-            </w:r>
-            <w:proofErr w:type="spellStart"/>
-            <w:r>
-              <w:rPr>
-                <w:rFonts w:ascii="Times New Roman" w:eastAsia="Times New Roman" w:hAnsi="Times New Roman" w:cs="Times New Roman"/>
-                <w:color w:val="000000"/>
-              </w:rPr>
-              <w:t>Penyampaian</w:t>
-            </w:r>
-            <w:proofErr w:type="spellEnd"/>
+              <w:t>Metode Penyampaian</w:t>
+            </w:r>
           </w:p>
         </w:tc>
         <w:tc>
@@ -5445,63 +4155,13 @@
                 <w:color w:val="000000"/>
               </w:rPr>
             </w:pPr>
-            <w:proofErr w:type="spellStart"/>
-            <w:r>
-              <w:rPr>
-                <w:rFonts w:ascii="Times New Roman" w:eastAsia="Times New Roman" w:hAnsi="Times New Roman" w:cs="Times New Roman"/>
-                <w:color w:val="000000"/>
-              </w:rPr>
-              <w:t>Berpenampilan</w:t>
-            </w:r>
-            <w:proofErr w:type="spellEnd"/>
-            <w:r>
-              <w:rPr>
-                <w:rFonts w:ascii="Times New Roman" w:eastAsia="Times New Roman" w:hAnsi="Times New Roman" w:cs="Times New Roman"/>
-                <w:color w:val="000000"/>
-              </w:rPr>
-              <w:t xml:space="preserve"> </w:t>
-            </w:r>
-            <w:proofErr w:type="spellStart"/>
-            <w:r>
-              <w:rPr>
-                <w:rFonts w:ascii="Times New Roman" w:eastAsia="Times New Roman" w:hAnsi="Times New Roman" w:cs="Times New Roman"/>
-                <w:color w:val="000000"/>
-              </w:rPr>
-              <w:t>rapi</w:t>
-            </w:r>
-            <w:proofErr w:type="spellEnd"/>
-            <w:r>
-              <w:rPr>
-                <w:rFonts w:ascii="Times New Roman" w:eastAsia="Times New Roman" w:hAnsi="Times New Roman" w:cs="Times New Roman"/>
-                <w:color w:val="000000"/>
-              </w:rPr>
-              <w:t xml:space="preserve"> </w:t>
-            </w:r>
-            <w:proofErr w:type="spellStart"/>
-            <w:r>
-              <w:rPr>
-                <w:rFonts w:ascii="Times New Roman" w:eastAsia="Times New Roman" w:hAnsi="Times New Roman" w:cs="Times New Roman"/>
-                <w:color w:val="000000"/>
-              </w:rPr>
-              <w:t>sesuai</w:t>
-            </w:r>
-            <w:proofErr w:type="spellEnd"/>
-            <w:r>
-              <w:rPr>
-                <w:rFonts w:ascii="Times New Roman" w:eastAsia="Times New Roman" w:hAnsi="Times New Roman" w:cs="Times New Roman"/>
-                <w:color w:val="000000"/>
-              </w:rPr>
-              <w:t xml:space="preserve"> </w:t>
-            </w:r>
-            <w:proofErr w:type="spellStart"/>
-            <w:r>
-              <w:rPr>
-                <w:rFonts w:ascii="Times New Roman" w:eastAsia="Times New Roman" w:hAnsi="Times New Roman" w:cs="Times New Roman"/>
-                <w:color w:val="000000"/>
-              </w:rPr>
-              <w:t>ketentuan</w:t>
-            </w:r>
-            <w:proofErr w:type="spellEnd"/>
+            <w:r>
+              <w:rPr>
+                <w:rFonts w:ascii="Times New Roman" w:eastAsia="Times New Roman" w:hAnsi="Times New Roman" w:cs="Times New Roman"/>
+                <w:color w:val="000000"/>
+              </w:rPr>
+              <w:t>Berpenampilan rapi sesuai ketentuan</w:t>
+            </w:r>
           </w:p>
         </w:tc>
         <w:tc>
@@ -5670,17 +4330,8 @@
                 <w:rFonts w:ascii="Times New Roman" w:eastAsia="Times New Roman" w:hAnsi="Times New Roman" w:cs="Times New Roman"/>
                 <w:color w:val="000000"/>
               </w:rPr>
-              <w:t xml:space="preserve">Teknik </w:t>
-            </w:r>
-            <w:proofErr w:type="spellStart"/>
-            <w:r>
-              <w:rPr>
-                <w:rFonts w:ascii="Times New Roman" w:eastAsia="Times New Roman" w:hAnsi="Times New Roman" w:cs="Times New Roman"/>
-                <w:color w:val="000000"/>
-              </w:rPr>
-              <w:t>presentasi</w:t>
-            </w:r>
-            <w:proofErr w:type="spellEnd"/>
+              <w:t>Teknik presentasi</w:t>
+            </w:r>
           </w:p>
         </w:tc>
         <w:tc>
@@ -5848,55 +4499,7 @@
                 <w:rFonts w:ascii="Times New Roman" w:eastAsia="Times New Roman" w:hAnsi="Times New Roman" w:cs="Times New Roman"/>
                 <w:color w:val="000000"/>
               </w:rPr>
-              <w:t xml:space="preserve">Materi </w:t>
-            </w:r>
-            <w:proofErr w:type="spellStart"/>
-            <w:r>
-              <w:rPr>
-                <w:rFonts w:ascii="Times New Roman" w:eastAsia="Times New Roman" w:hAnsi="Times New Roman" w:cs="Times New Roman"/>
-                <w:color w:val="000000"/>
-              </w:rPr>
-              <w:t>presentasi</w:t>
-            </w:r>
-            <w:proofErr w:type="spellEnd"/>
-            <w:r>
-              <w:rPr>
-                <w:rFonts w:ascii="Times New Roman" w:eastAsia="Times New Roman" w:hAnsi="Times New Roman" w:cs="Times New Roman"/>
-                <w:color w:val="000000"/>
-              </w:rPr>
-              <w:t xml:space="preserve"> </w:t>
-            </w:r>
-            <w:proofErr w:type="spellStart"/>
-            <w:r>
-              <w:rPr>
-                <w:rFonts w:ascii="Times New Roman" w:eastAsia="Times New Roman" w:hAnsi="Times New Roman" w:cs="Times New Roman"/>
-                <w:color w:val="000000"/>
-              </w:rPr>
-              <w:t>termasuk</w:t>
-            </w:r>
-            <w:proofErr w:type="spellEnd"/>
-            <w:r>
-              <w:rPr>
-                <w:rFonts w:ascii="Times New Roman" w:eastAsia="Times New Roman" w:hAnsi="Times New Roman" w:cs="Times New Roman"/>
-                <w:color w:val="000000"/>
-              </w:rPr>
-              <w:t xml:space="preserve"> </w:t>
-            </w:r>
-            <w:proofErr w:type="spellStart"/>
-            <w:r>
-              <w:rPr>
-                <w:rFonts w:ascii="Times New Roman" w:eastAsia="Times New Roman" w:hAnsi="Times New Roman" w:cs="Times New Roman"/>
-                <w:color w:val="000000"/>
-              </w:rPr>
-              <w:t>tampilan</w:t>
-            </w:r>
-            <w:proofErr w:type="spellEnd"/>
-            <w:r>
-              <w:rPr>
-                <w:rFonts w:ascii="Times New Roman" w:eastAsia="Times New Roman" w:hAnsi="Times New Roman" w:cs="Times New Roman"/>
-                <w:color w:val="000000"/>
-              </w:rPr>
-              <w:t xml:space="preserve"> slide</w:t>
+              <w:t>Materi presentasi termasuk tampilan slide</w:t>
             </w:r>
           </w:p>
         </w:tc>
@@ -6106,25 +4709,7 @@
           <w:sz w:val="24"/>
           <w:szCs w:val="24"/>
         </w:rPr>
-        <w:t xml:space="preserve">Dosen </w:t>
-      </w:r>
-      <w:proofErr w:type="spellStart"/>
-      <w:r>
-        <w:rPr>
-          <w:rFonts w:ascii="Times New Roman" w:eastAsia="Calibri" w:hAnsi="Times New Roman" w:cs="Times New Roman"/>
-          <w:sz w:val="24"/>
-          <w:szCs w:val="24"/>
-        </w:rPr>
-        <w:t>Penguji</w:t>
-      </w:r>
-      <w:proofErr w:type="spellEnd"/>
-      <w:r>
-        <w:rPr>
-          <w:rFonts w:ascii="Times New Roman" w:eastAsia="Calibri" w:hAnsi="Times New Roman" w:cs="Times New Roman"/>
-          <w:sz w:val="24"/>
-          <w:szCs w:val="24"/>
-        </w:rPr>
-        <w:t>,</w:t>
+        <w:t>Dosen Penguji,</w:t>
       </w:r>
     </w:p>
     <w:p>
@@ -6271,18 +4856,8 @@
                 <w:sz w:val="24"/>
                 <w:szCs w:val="24"/>
               </w:rPr>
-              <w:t xml:space="preserve">Dosen </w:t>
-            </w:r>
-            <w:proofErr w:type="spellStart"/>
-            <w:r>
-              <w:rPr>
-                <w:rFonts w:ascii="Times New Roman" w:eastAsia="Calibri" w:hAnsi="Times New Roman" w:cs="Times New Roman"/>
-                <w:sz w:val="24"/>
-                <w:szCs w:val="24"/>
-              </w:rPr>
-              <w:t>Penguji</w:t>
-            </w:r>
-            <w:proofErr w:type="spellEnd"/>
+              <w:t>Dosen Penguji</w:t>
+            </w:r>
           </w:p>
         </w:tc>
         <w:tc>
@@ -6437,18 +5012,8 @@
                 <w:sz w:val="24"/>
                 <w:szCs w:val="24"/>
               </w:rPr>
-              <w:t xml:space="preserve">Nama </w:t>
-            </w:r>
-            <w:proofErr w:type="spellStart"/>
-            <w:r>
-              <w:rPr>
-                <w:rFonts w:ascii="Times New Roman" w:eastAsia="Calibri" w:hAnsi="Times New Roman" w:cs="Times New Roman"/>
-                <w:sz w:val="24"/>
-                <w:szCs w:val="24"/>
-              </w:rPr>
-              <w:t>Mahasiswa</w:t>
-            </w:r>
-            <w:proofErr w:type="spellEnd"/>
+              <w:t>Nama Mahasiswa</w:t>
+            </w:r>
           </w:p>
         </w:tc>
         <w:tc>
@@ -6495,25 +5060,7 @@
                 <w:sz w:val="24"/>
                 <w:szCs w:val="24"/>
               </w:rPr>
-              <w:t>{</w:t>
-            </w:r>
-            <w:proofErr w:type="spellStart"/>
-            <w:r>
-              <w:rPr>
-                <w:rFonts w:ascii="Times New Roman" w:eastAsia="Calibri" w:hAnsi="Times New Roman" w:cs="Times New Roman"/>
-                <w:sz w:val="24"/>
-                <w:szCs w:val="24"/>
-              </w:rPr>
-              <w:t>nama_mhs</w:t>
-            </w:r>
-            <w:proofErr w:type="spellEnd"/>
-            <w:r>
-              <w:rPr>
-                <w:rFonts w:ascii="Times New Roman" w:eastAsia="Calibri" w:hAnsi="Times New Roman" w:cs="Times New Roman"/>
-                <w:sz w:val="24"/>
-                <w:szCs w:val="24"/>
-              </w:rPr>
-              <w:t>}</w:t>
+              <w:t>{nama_mhs}</w:t>
             </w:r>
           </w:p>
         </w:tc>
@@ -6615,23 +5162,13 @@
                 <w:szCs w:val="24"/>
               </w:rPr>
             </w:pPr>
-            <w:proofErr w:type="spellStart"/>
-            <w:r>
-              <w:rPr>
-                <w:rFonts w:ascii="Times New Roman" w:eastAsia="Calibri" w:hAnsi="Times New Roman" w:cs="Times New Roman"/>
-                <w:sz w:val="24"/>
-                <w:szCs w:val="24"/>
-              </w:rPr>
-              <w:t>Judul</w:t>
-            </w:r>
-            <w:proofErr w:type="spellEnd"/>
-            <w:r>
-              <w:rPr>
-                <w:rFonts w:ascii="Times New Roman" w:eastAsia="Calibri" w:hAnsi="Times New Roman" w:cs="Times New Roman"/>
-                <w:sz w:val="24"/>
-                <w:szCs w:val="24"/>
-              </w:rPr>
-              <w:t xml:space="preserve"> KP</w:t>
+            <w:r>
+              <w:rPr>
+                <w:rFonts w:ascii="Times New Roman" w:eastAsia="Calibri" w:hAnsi="Times New Roman" w:cs="Times New Roman"/>
+                <w:sz w:val="24"/>
+                <w:szCs w:val="24"/>
+              </w:rPr>
+              <w:t>Judul KP</w:t>
             </w:r>
           </w:p>
         </w:tc>
@@ -6679,25 +5216,7 @@
                 <w:sz w:val="24"/>
                 <w:szCs w:val="24"/>
               </w:rPr>
-              <w:t>{</w:t>
-            </w:r>
-            <w:proofErr w:type="spellStart"/>
-            <w:r>
-              <w:rPr>
-                <w:rFonts w:ascii="Times New Roman" w:eastAsia="Calibri" w:hAnsi="Times New Roman" w:cs="Times New Roman"/>
-                <w:sz w:val="24"/>
-                <w:szCs w:val="24"/>
-              </w:rPr>
-              <w:t>judul_kp</w:t>
-            </w:r>
-            <w:proofErr w:type="spellEnd"/>
-            <w:r>
-              <w:rPr>
-                <w:rFonts w:ascii="Times New Roman" w:eastAsia="Calibri" w:hAnsi="Times New Roman" w:cs="Times New Roman"/>
-                <w:sz w:val="24"/>
-                <w:szCs w:val="24"/>
-              </w:rPr>
-              <w:t>}</w:t>
+              <w:t>{judul_kp}</w:t>
             </w:r>
           </w:p>
         </w:tc>
@@ -6717,23 +5236,13 @@
                 <w:szCs w:val="24"/>
               </w:rPr>
             </w:pPr>
-            <w:proofErr w:type="spellStart"/>
-            <w:r>
-              <w:rPr>
-                <w:rFonts w:ascii="Times New Roman" w:eastAsia="Calibri" w:hAnsi="Times New Roman" w:cs="Times New Roman"/>
-                <w:sz w:val="24"/>
-                <w:szCs w:val="24"/>
-              </w:rPr>
-              <w:t>Tanggal</w:t>
-            </w:r>
-            <w:proofErr w:type="spellEnd"/>
-            <w:r>
-              <w:rPr>
-                <w:rFonts w:ascii="Times New Roman" w:eastAsia="Calibri" w:hAnsi="Times New Roman" w:cs="Times New Roman"/>
-                <w:sz w:val="24"/>
-                <w:szCs w:val="24"/>
-              </w:rPr>
-              <w:t xml:space="preserve"> Seminar</w:t>
+            <w:r>
+              <w:rPr>
+                <w:rFonts w:ascii="Times New Roman" w:eastAsia="Calibri" w:hAnsi="Times New Roman" w:cs="Times New Roman"/>
+                <w:sz w:val="24"/>
+                <w:szCs w:val="24"/>
+              </w:rPr>
+              <w:t>Tanggal Seminar</w:t>
             </w:r>
           </w:p>
         </w:tc>
@@ -6781,25 +5290,7 @@
                 <w:sz w:val="24"/>
                 <w:szCs w:val="24"/>
               </w:rPr>
-              <w:t xml:space="preserve">{tgl_cetak}</w:t>
-            </w:r>
-            <w:proofErr w:type="spellStart"/>
-            <w:r>
-              <w:rPr>
-                <w:rFonts w:ascii="Times New Roman" w:eastAsia="Calibri" w:hAnsi="Times New Roman" w:cs="Times New Roman"/>
-                <w:sz w:val="24"/>
-                <w:szCs w:val="24"/>
-              </w:rPr>
-              <w:t xml:space="preserve"/>
-            </w:r>
-            <w:proofErr w:type="spellEnd"/>
-            <w:r>
-              <w:rPr>
-                <w:rFonts w:ascii="Times New Roman" w:eastAsia="Calibri" w:hAnsi="Times New Roman" w:cs="Times New Roman"/>
-                <w:sz w:val="24"/>
-                <w:szCs w:val="24"/>
-              </w:rPr>
-              <w:t xml:space="preserve"/>
+              <w:t>{tgl_cetak}</w:t>
             </w:r>
           </w:p>
         </w:tc>
@@ -7327,18 +5818,8 @@
           <w:sz w:val="24"/>
           <w:szCs w:val="24"/>
         </w:rPr>
-        <w:t xml:space="preserve">Dosen </w:t>
+        <w:t>Dosen Penguji</w:t>
       </w:r>
-      <w:proofErr w:type="spellStart"/>
-      <w:r>
-        <w:rPr>
-          <w:rFonts w:ascii="Times New Roman" w:eastAsia="Calibri" w:hAnsi="Times New Roman" w:cs="Times New Roman"/>
-          <w:sz w:val="24"/>
-          <w:szCs w:val="24"/>
-        </w:rPr>
-        <w:t>Penguji</w:t>
-      </w:r>
-      <w:proofErr w:type="spellEnd"/>
     </w:p>
     <w:p>
       <w:pPr>
@@ -7541,7 +6022,6 @@
         </mc:Fallback>
       </mc:AlternateContent>
     </w:r>
-    <w:proofErr w:type="spellStart"/>
     <w:r>
       <w:rPr>
         <w:rFonts w:ascii="Times New Roman" w:hAnsi="Times New Roman" w:cs="Times New Roman"/>
@@ -7550,7 +6030,6 @@
       </w:rPr>
       <w:t>Dicetak</w:t>
     </w:r>
-    <w:proofErr w:type="spellEnd"/>
     <w:r>
       <w:rPr>
         <w:rFonts w:ascii="Times New Roman" w:hAnsi="Times New Roman" w:cs="Times New Roman"/>
@@ -7559,23 +6038,13 @@
       </w:rPr>
       <w:t xml:space="preserve"> </w:t>
     </w:r>
-    <w:proofErr w:type="spellStart"/>
     <w:r>
       <w:rPr>
         <w:rFonts w:ascii="Times New Roman" w:hAnsi="Times New Roman" w:cs="Times New Roman"/>
         <w:sz w:val="18"/>
         <w:szCs w:val="18"/>
       </w:rPr>
-      <w:t>tgl</w:t>
-    </w:r>
-    <w:proofErr w:type="spellEnd"/>
-    <w:r>
-      <w:rPr>
-        <w:rFonts w:ascii="Times New Roman" w:hAnsi="Times New Roman" w:cs="Times New Roman"/>
-        <w:sz w:val="18"/>
-        <w:szCs w:val="18"/>
-      </w:rPr>
-      <w:t>:</w:t>
+      <w:t>tgl:</w:t>
     </w:r>
     <w:bookmarkEnd w:id="2"/>
     <w:bookmarkEnd w:id="3"/>
@@ -7585,25 +6054,7 @@
         <w:sz w:val="18"/>
         <w:szCs w:val="18"/>
       </w:rPr>
-      <w:t xml:space="preserve"> {</w:t>
-    </w:r>
-    <w:proofErr w:type="spellStart"/>
-    <w:r>
-      <w:rPr>
-        <w:rFonts w:ascii="Times New Roman" w:hAnsi="Times New Roman" w:cs="Times New Roman"/>
-        <w:sz w:val="18"/>
-        <w:szCs w:val="18"/>
-      </w:rPr>
-      <w:t>tgl_cetak</w:t>
-    </w:r>
-    <w:proofErr w:type="spellEnd"/>
-    <w:r>
-      <w:rPr>
-        <w:rFonts w:ascii="Times New Roman" w:hAnsi="Times New Roman" w:cs="Times New Roman"/>
-        <w:sz w:val="18"/>
-        <w:szCs w:val="18"/>
-      </w:rPr>
-      <w:t>}</w:t>
+      <w:t xml:space="preserve"> {tgl_cetak}</w:t>
     </w:r>
   </w:p>
 </w:ftr>
@@ -7893,58 +6344,7 @@
               <w:sz w:val="18"/>
               <w:szCs w:val="18"/>
             </w:rPr>
-            <w:t xml:space="preserve">Jalan Prof. </w:t>
-          </w:r>
-          <w:proofErr w:type="spellStart"/>
-          <w:r>
-            <w:rPr>
-              <w:rFonts w:ascii="Times New Roman" w:hAnsi="Times New Roman"/>
-              <w:color w:val="0070C0"/>
-              <w:sz w:val="18"/>
-              <w:szCs w:val="18"/>
-            </w:rPr>
-            <w:t>Sudarto</w:t>
-          </w:r>
-          <w:proofErr w:type="spellEnd"/>
-          <w:r>
-            <w:rPr>
-              <w:rFonts w:ascii="Times New Roman" w:hAnsi="Times New Roman"/>
-              <w:color w:val="0070C0"/>
-              <w:sz w:val="18"/>
-              <w:szCs w:val="18"/>
-            </w:rPr>
-            <w:t>, S.H.</w:t>
-          </w:r>
-        </w:p>
-        <w:p>
-          <w:pPr>
-            <w:jc w:val="right"/>
-            <w:rPr>
-              <w:rFonts w:ascii="Times New Roman" w:hAnsi="Times New Roman"/>
-              <w:color w:val="0070C0"/>
-              <w:sz w:val="18"/>
-              <w:szCs w:val="18"/>
-            </w:rPr>
-          </w:pPr>
-          <w:proofErr w:type="spellStart"/>
-          <w:r>
-            <w:rPr>
-              <w:rFonts w:ascii="Times New Roman" w:hAnsi="Times New Roman"/>
-              <w:color w:val="0070C0"/>
-              <w:sz w:val="18"/>
-              <w:szCs w:val="18"/>
-            </w:rPr>
-            <w:t>Tembalang</w:t>
-          </w:r>
-          <w:proofErr w:type="spellEnd"/>
-          <w:r>
-            <w:rPr>
-              <w:rFonts w:ascii="Times New Roman" w:hAnsi="Times New Roman"/>
-              <w:color w:val="0070C0"/>
-              <w:sz w:val="18"/>
-              <w:szCs w:val="18"/>
-            </w:rPr>
-            <w:t xml:space="preserve"> Semarang Kode Pos 50275</w:t>
+            <w:t>Jalan Prof. Sudarto, S.H.</w:t>
           </w:r>
         </w:p>
         <w:p>
@@ -7964,9 +6364,19 @@
               <w:sz w:val="18"/>
               <w:szCs w:val="18"/>
             </w:rPr>
-            <w:t xml:space="preserve">Tel. (024) 76480678, </w:t>
+            <w:t>Tembalang Semarang Kode Pos 50275</w:t>
           </w:r>
-          <w:proofErr w:type="spellStart"/>
+        </w:p>
+        <w:p>
+          <w:pPr>
+            <w:jc w:val="right"/>
+            <w:rPr>
+              <w:rFonts w:ascii="Times New Roman" w:hAnsi="Times New Roman"/>
+              <w:color w:val="0070C0"/>
+              <w:sz w:val="18"/>
+              <w:szCs w:val="18"/>
+            </w:rPr>
+          </w:pPr>
           <w:r>
             <w:rPr>
               <w:rFonts w:ascii="Times New Roman" w:hAnsi="Times New Roman"/>
@@ -7974,17 +6384,7 @@
               <w:sz w:val="18"/>
               <w:szCs w:val="18"/>
             </w:rPr>
-            <w:t>Faks</w:t>
-          </w:r>
-          <w:proofErr w:type="spellEnd"/>
-          <w:r>
-            <w:rPr>
-              <w:rFonts w:ascii="Times New Roman" w:hAnsi="Times New Roman"/>
-              <w:color w:val="0070C0"/>
-              <w:sz w:val="18"/>
-              <w:szCs w:val="18"/>
-            </w:rPr>
-            <w:t>. (024) 7460053</w:t>
+            <w:t>Tel. (024) 76480678, Faks. (024) 7460053</w:t>
           </w:r>
         </w:p>
         <w:p>

</xml_diff>